<commit_message>
docs: update functional spec to v1.4
</commit_message>
<xml_diff>
--- a/docs/JedForge-FunctionalSpec-v1.0.docx
+++ b/docs/JedForge-FunctionalSpec-v1.0.docx
@@ -53,7 +53,7 @@
           <w:sz w:val="24"/>
           <w:szCs w:val="24"/>
         </w:rPr>
-        <w:t xml:space="preserve">Version 1.2  •  May 2026</w:t>
+        <w:t xml:space="preserve">Version 1.4  •  May 2026</w:t>
       </w:r>
     </w:p>
     <w:p>
@@ -720,7 +720,25 @@
           <w:sz w:val="22"/>
           <w:szCs w:val="22"/>
         </w:rPr>
-        <w:t xml:space="preserve">Accounts are created manually by an Admin. There is no self-registration or public sign-up flow. Authentication is handled via credentials (email + password) and GitHub OAuth.</w:t>
+        <w:t xml:space="preserve">Accounts are created manually by an Admin. There is no self-registration or public sign-up flow. The /register route returns a 403 and the register page displays a contact-your-administrator message. The only way to create an account is through the Admin panel at /admin/users.</w:t>
+      </w:r>
+    </w:p>
+    <w:p>
+      <w:pPr>
+        <w:shd w:fill="FFFBEB" w:val="clear"/>
+        <w:spacing w:after="60" w:before="60"/>
+        <w:ind w:left="360"/>
+      </w:pPr>
+      <w:r>
+        <w:rPr>
+          <w:rFonts w:ascii="Arial" w:cs="Arial" w:eastAsia="Arial" w:hAnsi="Arial"/>
+          <w:i/>
+          <w:iCs/>
+          <w:color w:val="B45309"/>
+          <w:sz w:val="20"/>
+          <w:szCs w:val="20"/>
+        </w:rPr>
+        <w:t xml:space="preserve">⚠ GitHub OAuth login is planned but not yet implemented. Only Credentials (email + password) login is currently active.</w:t>
       </w:r>
     </w:p>
     <w:p>
@@ -2887,7 +2905,7 @@
                 <w:sz w:val="20"/>
                 <w:szCs w:val="20"/>
               </w:rPr>
-              <w:t xml:space="preserve">Projects</w:t>
+              <w:t xml:space="preserve">Projects (create, delete)</w:t>
             </w:r>
           </w:p>
         </w:tc>
@@ -2961,7 +2979,7 @@
                 <w:sz w:val="20"/>
                 <w:szCs w:val="20"/>
               </w:rPr>
-              <w:t xml:space="preserve">Create, archive, and delete projects. Each team/org operates in its own isolated workspace.</w:t>
+              <w:t xml:space="preserve">Create and delete projects confirmed. Each org operates in its own isolated workspace.</w:t>
             </w:r>
           </w:p>
         </w:tc>
@@ -3000,7 +3018,7 @@
                 <w:sz w:val="20"/>
                 <w:szCs w:val="20"/>
               </w:rPr>
-              <w:t xml:space="preserve">Issues / Tickets</w:t>
+              <w:t xml:space="preserve">Project Archive</w:t>
             </w:r>
           </w:p>
         </w:tc>
@@ -3074,7 +3092,7 @@
                 <w:sz w:val="20"/>
                 <w:szCs w:val="20"/>
               </w:rPr>
-              <w:t xml:space="preserve">Full lifecycle: create, assign, set status and priority, and close. Rich detail view with activity log.</w:t>
+              <w:t xml:space="preserve">isArchived field on Project model. archiveProject server action. Archived projects excluded from default project list. Toggle in project settings, accessible to Project Leads and Admins.</w:t>
             </w:r>
           </w:p>
         </w:tc>
@@ -3113,7 +3131,7 @@
                 <w:sz w:val="20"/>
                 <w:szCs w:val="20"/>
               </w:rPr>
-              <w:t xml:space="preserve">Subtasks</w:t>
+              <w:t xml:space="preserve">Project Privacy</w:t>
             </w:r>
           </w:p>
         </w:tc>
@@ -3187,7 +3205,7 @@
                 <w:sz w:val="20"/>
                 <w:szCs w:val="20"/>
               </w:rPr>
-              <w:t xml:space="preserve">Issues can contain nested subtasks. Subtasks follow the same status model as parent issues.</w:t>
+              <w:t xml:space="preserve">isPrivate field on Project model. setProjectPrivacy server action. Private projects invisible to non-members in lists and search. Admin-only toggle in project settings.</w:t>
             </w:r>
           </w:p>
         </w:tc>
@@ -3226,7 +3244,7 @@
                 <w:sz w:val="20"/>
                 <w:szCs w:val="20"/>
               </w:rPr>
-              <w:t xml:space="preserve">Comments</w:t>
+              <w:t xml:space="preserve">Issues / Tickets</w:t>
             </w:r>
           </w:p>
         </w:tc>
@@ -3300,7 +3318,7 @@
                 <w:sz w:val="20"/>
                 <w:szCs w:val="20"/>
               </w:rPr>
-              <w:t xml:space="preserve">Users can comment on issues. Activity and comments are displayed in a unified feed on the issue detail view.</w:t>
+              <w:t xml:space="preserve">Full lifecycle: create, assign, set status and priority, and close. Rich text descriptions via TipTap. Full detail view with activity log.</w:t>
             </w:r>
           </w:p>
         </w:tc>
@@ -3339,7 +3357,7 @@
                 <w:sz w:val="20"/>
                 <w:szCs w:val="20"/>
               </w:rPr>
-              <w:t xml:space="preserve">Labels / Tags</w:t>
+              <w:t xml:space="preserve">Subtasks</w:t>
             </w:r>
           </w:p>
         </w:tc>
@@ -3413,7 +3431,7 @@
                 <w:sz w:val="20"/>
                 <w:szCs w:val="20"/>
               </w:rPr>
-              <w:t xml:space="preserve">Issues can be tagged with one or more labels for filtering and categorization.</w:t>
+              <w:t xml:space="preserve">Issues can contain nested subtasks via Issue.parentId FK. Sub-Issues panel in IssueDetail.</w:t>
             </w:r>
           </w:p>
         </w:tc>
@@ -3452,7 +3470,7 @@
                 <w:sz w:val="20"/>
                 <w:szCs w:val="20"/>
               </w:rPr>
-              <w:t xml:space="preserve">Kanban Board View</w:t>
+              <w:t xml:space="preserve">Comments</w:t>
             </w:r>
           </w:p>
         </w:tc>
@@ -3526,7 +3544,7 @@
                 <w:sz w:val="20"/>
                 <w:szCs w:val="20"/>
               </w:rPr>
-              <w:t xml:space="preserve">Drag-and-drop board view organized by issue status columns using @dnd-kit.</w:t>
+              <w:t xml:space="preserve">Full comment thread with create, edit, delete. Rich text via TipTap. Displayed in issue detail view.</w:t>
             </w:r>
           </w:p>
         </w:tc>
@@ -3565,7 +3583,7 @@
                 <w:sz w:val="20"/>
                 <w:szCs w:val="20"/>
               </w:rPr>
-              <w:t xml:space="preserve">List / Table View</w:t>
+              <w:t xml:space="preserve">Labels / Tags</w:t>
             </w:r>
           </w:p>
         </w:tc>
@@ -3639,7 +3657,7 @@
                 <w:sz w:val="20"/>
                 <w:szCs w:val="20"/>
               </w:rPr>
-              <w:t xml:space="preserve">Tabular view of issues with sortable columns and filtering.</w:t>
+              <w:t xml:space="preserve">Labels stored as String[] on issues. LabelInput component. Filter and query language support.</w:t>
             </w:r>
           </w:p>
         </w:tc>
@@ -3678,7 +3696,7 @@
                 <w:sz w:val="20"/>
                 <w:szCs w:val="20"/>
               </w:rPr>
-              <w:t xml:space="preserve">Activity Feed / Audit Log</w:t>
+              <w:t xml:space="preserve">Kanban Board View</w:t>
             </w:r>
           </w:p>
         </w:tc>
@@ -3752,7 +3770,7 @@
                 <w:sz w:val="20"/>
                 <w:szCs w:val="20"/>
               </w:rPr>
-              <w:t xml:space="preserve">Real-time SSE-powered feed showing all project and issue events.</w:t>
+              <w:t xml:space="preserve">Drag-and-drop board using @dnd-kit. moveIssue and reorderIssues server actions. Board page per project.</w:t>
             </w:r>
           </w:p>
         </w:tc>
@@ -3791,7 +3809,7 @@
                 <w:sz w:val="20"/>
                 <w:szCs w:val="20"/>
               </w:rPr>
-              <w:t xml:space="preserve">In-App Notifications</w:t>
+              <w:t xml:space="preserve">List / Table View</w:t>
             </w:r>
           </w:p>
         </w:tc>
@@ -3865,7 +3883,7 @@
                 <w:sz w:val="20"/>
                 <w:szCs w:val="20"/>
               </w:rPr>
-              <w:t xml:space="preserve">Users receive in-app notifications for events relevant to them (assignments, mentions, status changes).</w:t>
+              <w:t xml:space="preserve">IssueList component with sortable columns. IssueFiltersBar for filtering.</w:t>
             </w:r>
           </w:p>
         </w:tc>
@@ -3904,7 +3922,7 @@
                 <w:sz w:val="20"/>
                 <w:szCs w:val="20"/>
               </w:rPr>
-              <w:t xml:space="preserve">User Profile / Avatar</w:t>
+              <w:t xml:space="preserve">Activity Feed / Audit Log</w:t>
             </w:r>
           </w:p>
         </w:tc>
@@ -3978,7 +3996,7 @@
                 <w:sz w:val="20"/>
                 <w:szCs w:val="20"/>
               </w:rPr>
-              <w:t xml:space="preserve">Users have a profile with display name and avatar.</w:t>
+              <w:t xml:space="preserve">ActivityLog model and ActivityFeed component. Activity logged on create, update, comment, attach. Currently polling-based (not SSE — see Section 7).</w:t>
             </w:r>
           </w:p>
         </w:tc>
@@ -4017,7 +4035,7 @@
                 <w:sz w:val="20"/>
                 <w:szCs w:val="20"/>
               </w:rPr>
-              <w:t xml:space="preserve">Search</w:t>
+              <w:t xml:space="preserve">In-App Notifications</w:t>
             </w:r>
           </w:p>
         </w:tc>
@@ -4050,11 +4068,11 @@
                 <w:bCs w:val="false"/>
                 <w:i w:val="false"/>
                 <w:iCs w:val="false"/>
-                <w:color w:val="166534"/>
-                <w:sz w:val="20"/>
-                <w:szCs w:val="20"/>
-              </w:rPr>
-              <w:t xml:space="preserve">Built</w:t>
+                <w:color w:val="4A5568"/>
+                <w:sz w:val="20"/>
+                <w:szCs w:val="20"/>
+              </w:rPr>
+              <w:t xml:space="preserve">Not Built</w:t>
             </w:r>
           </w:p>
         </w:tc>
@@ -4091,7 +4109,7 @@
                 <w:sz w:val="20"/>
                 <w:szCs w:val="20"/>
               </w:rPr>
-              <w:t xml:space="preserve">Global search across issues, projects, and users.</w:t>
+              <w:t xml:space="preserve">No Notification model, no routes, no UI components. Previously marked as Built in spec — this was incorrect. Planned for implementation.</w:t>
             </w:r>
           </w:p>
         </w:tc>
@@ -4130,7 +4148,7 @@
                 <w:sz w:val="20"/>
                 <w:szCs w:val="20"/>
               </w:rPr>
-              <w:t xml:space="preserve">File Attachments</w:t>
+              <w:t xml:space="preserve">User Profile / Avatar</w:t>
             </w:r>
           </w:p>
         </w:tc>
@@ -4163,11 +4181,11 @@
                 <w:bCs w:val="false"/>
                 <w:i w:val="false"/>
                 <w:iCs w:val="false"/>
-                <w:color w:val="92400E"/>
-                <w:sz w:val="20"/>
-                <w:szCs w:val="20"/>
-              </w:rPr>
-              <w:t xml:space="preserve">Planned</w:t>
+                <w:color w:val="166534"/>
+                <w:sz w:val="20"/>
+                <w:szCs w:val="20"/>
+              </w:rPr>
+              <w:t xml:space="preserve">Built</w:t>
             </w:r>
           </w:p>
         </w:tc>
@@ -4204,7 +4222,7 @@
                 <w:sz w:val="20"/>
                 <w:szCs w:val="20"/>
               </w:rPr>
-              <w:t xml:space="preserve">Upload screenshots and files directly to issues. Stored in Railway Storage Buckets (S3-compatible). Implementation plan defined.</w:t>
+              <w:t xml:space="preserve">User avatarUrl field in schema. AvatarUpload component. Avatar stored in Railway S3 with presigned URL routing.</w:t>
             </w:r>
           </w:p>
         </w:tc>
@@ -4243,7 +4261,7 @@
                 <w:sz w:val="20"/>
                 <w:szCs w:val="20"/>
               </w:rPr>
-              <w:t xml:space="preserve">Customizable Workflows</w:t>
+              <w:t xml:space="preserve">Search</w:t>
             </w:r>
           </w:p>
         </w:tc>
@@ -4276,11 +4294,11 @@
                 <w:bCs w:val="false"/>
                 <w:i w:val="false"/>
                 <w:iCs w:val="false"/>
-                <w:color w:val="92400E"/>
-                <w:sz w:val="20"/>
-                <w:szCs w:val="20"/>
-              </w:rPr>
-              <w:t xml:space="preserve">Planned</w:t>
+                <w:color w:val="166534"/>
+                <w:sz w:val="20"/>
+                <w:szCs w:val="20"/>
+              </w:rPr>
+              <w:t xml:space="preserve">Built</w:t>
             </w:r>
           </w:p>
         </w:tc>
@@ -4317,7 +4335,7 @@
                 <w:sz w:val="20"/>
                 <w:szCs w:val="20"/>
               </w:rPr>
-              <w:t xml:space="preserve">Admins define custom named statuses mapped to system categories (To Do, In Progress, Done). Workspace defaults apply to all projects; projects can override. Deletion requires replacement selection if issues are affected.</w:t>
+              <w:t xml:space="preserve">Full custom query language engine (parse → validate → execute pipeline). QueryBar, QueryResults, SavedFilters components. Autocomplete supported. Search page at /search.</w:t>
             </w:r>
           </w:p>
         </w:tc>
@@ -4356,7 +4374,7 @@
                 <w:sz w:val="20"/>
                 <w:szCs w:val="20"/>
               </w:rPr>
-              <w:t xml:space="preserve">Email Notifications</w:t>
+              <w:t xml:space="preserve">Saved Filters</w:t>
             </w:r>
           </w:p>
         </w:tc>
@@ -4389,11 +4407,11 @@
                 <w:bCs w:val="false"/>
                 <w:i w:val="false"/>
                 <w:iCs w:val="false"/>
-                <w:color w:val="92400E"/>
-                <w:sz w:val="20"/>
-                <w:szCs w:val="20"/>
-              </w:rPr>
-              <w:t xml:space="preserve">Planned</w:t>
+                <w:color w:val="166534"/>
+                <w:sz w:val="20"/>
+                <w:szCs w:val="20"/>
+              </w:rPr>
+              <w:t xml:space="preserve">Built</w:t>
             </w:r>
           </w:p>
         </w:tc>
@@ -4430,7 +4448,7 @@
                 <w:sz w:val="20"/>
                 <w:szCs w:val="20"/>
               </w:rPr>
-              <w:t xml:space="preserve">Outbound email notifications for key events (assignments, mentions, due dates).</w:t>
+              <w:t xml:space="preserve">SavedFilter model in schema. Users can name and persist search queries. isGlobal flag for Admin-shared filters. Not previously documented in spec.</w:t>
             </w:r>
           </w:p>
         </w:tc>
@@ -4469,7 +4487,7 @@
                 <w:sz w:val="20"/>
                 <w:szCs w:val="20"/>
               </w:rPr>
-              <w:t xml:space="preserve">Sprints / Iterations</w:t>
+              <w:t xml:space="preserve">Rich Text Editor</w:t>
             </w:r>
           </w:p>
         </w:tc>
@@ -4502,11 +4520,11 @@
                 <w:bCs w:val="false"/>
                 <w:i w:val="false"/>
                 <w:iCs w:val="false"/>
-                <w:color w:val="92400E"/>
-                <w:sz w:val="20"/>
-                <w:szCs w:val="20"/>
-              </w:rPr>
-              <w:t xml:space="preserve">Planned</w:t>
+                <w:color w:val="166534"/>
+                <w:sz w:val="20"/>
+                <w:szCs w:val="20"/>
+              </w:rPr>
+              <w:t xml:space="preserve">Built</w:t>
             </w:r>
           </w:p>
         </w:tc>
@@ -4543,7 +4561,7 @@
                 <w:sz w:val="20"/>
                 <w:szCs w:val="20"/>
               </w:rPr>
-              <w:t xml:space="preserve">Time-boxed sprints scoped to a project with backlog management.</w:t>
+              <w:t xml:space="preserve">TipTap v2 used for issue descriptions and comments. RichTextEditor and RichTextDisplay components. Not previously documented in spec.</w:t>
             </w:r>
           </w:p>
         </w:tc>
@@ -4582,7 +4600,7 @@
                 <w:sz w:val="20"/>
                 <w:szCs w:val="20"/>
               </w:rPr>
-              <w:t xml:space="preserve">Milestones</w:t>
+              <w:t xml:space="preserve">Admin Panel</w:t>
             </w:r>
           </w:p>
         </w:tc>
@@ -4615,11 +4633,11 @@
                 <w:bCs w:val="false"/>
                 <w:i w:val="false"/>
                 <w:iCs w:val="false"/>
-                <w:color w:val="92400E"/>
-                <w:sz w:val="20"/>
-                <w:szCs w:val="20"/>
-              </w:rPr>
-              <w:t xml:space="preserve">Planned</w:t>
+                <w:color w:val="166534"/>
+                <w:sz w:val="20"/>
+                <w:szCs w:val="20"/>
+              </w:rPr>
+              <w:t xml:space="preserve">Built</w:t>
             </w:r>
           </w:p>
         </w:tc>
@@ -4656,7 +4674,7 @@
                 <w:sz w:val="20"/>
                 <w:szCs w:val="20"/>
               </w:rPr>
-              <w:t xml:space="preserve">Named milestones with due dates that issues can be associated with.</w:t>
+              <w:t xml:space="preserve">Full admin UI for user, project, and organisation management at /admin. Admin-only routes protected by requireAdmin(). Not previously documented in spec.</w:t>
             </w:r>
           </w:p>
         </w:tc>
@@ -4695,7 +4713,7 @@
                 <w:sz w:val="20"/>
                 <w:szCs w:val="20"/>
               </w:rPr>
-              <w:t xml:space="preserve">Roadmap / Timeline (Gantt)</w:t>
+              <w:t xml:space="preserve">File Attachments</w:t>
             </w:r>
           </w:p>
         </w:tc>
@@ -4728,11 +4746,11 @@
                 <w:bCs w:val="false"/>
                 <w:i w:val="false"/>
                 <w:iCs w:val="false"/>
-                <w:color w:val="92400E"/>
-                <w:sz w:val="20"/>
-                <w:szCs w:val="20"/>
-              </w:rPr>
-              <w:t xml:space="preserve">Planned</w:t>
+                <w:color w:val="166534"/>
+                <w:sz w:val="20"/>
+                <w:szCs w:val="20"/>
+              </w:rPr>
+              <w:t xml:space="preserve">Built</w:t>
             </w:r>
           </w:p>
         </w:tc>
@@ -4769,7 +4787,7 @@
                 <w:sz w:val="20"/>
                 <w:szCs w:val="20"/>
               </w:rPr>
-              <w:t xml:space="preserve">Visual timeline view of milestones and epics across a project.</w:t>
+              <w:t xml:space="preserve">Fully implemented. Attachment model in schema. Six API routes (presign, upload, confirm, list, delete, URL refresh). AttachmentsPanel with drag-and-drop and progress. Previously marked as Planned — now confirmed Built.</w:t>
             </w:r>
           </w:p>
         </w:tc>
@@ -4808,7 +4826,7 @@
                 <w:sz w:val="20"/>
                 <w:szCs w:val="20"/>
               </w:rPr>
-              <w:t xml:space="preserve">Dashboard / Analytics</w:t>
+              <w:t xml:space="preserve">Customizable Workflows</w:t>
             </w:r>
           </w:p>
         </w:tc>
@@ -4882,7 +4900,7 @@
                 <w:sz w:val="20"/>
                 <w:szCs w:val="20"/>
               </w:rPr>
-              <w:t xml:space="preserve">Summary view showing open issues, velocity, burndown, and team workload.</w:t>
+              <w:t xml:space="preserve">Admins define custom named statuses mapped to system categories (To Do, In Progress, Done). Workflow design is fully resolved (see Section 5). Currently issue status is a fixed 4-value enum in code — custom workflow system not yet built.</w:t>
             </w:r>
           </w:p>
         </w:tc>
@@ -4921,7 +4939,7 @@
                 <w:sz w:val="20"/>
                 <w:szCs w:val="20"/>
               </w:rPr>
-              <w:t xml:space="preserve">GitHub Integration</w:t>
+              <w:t xml:space="preserve">Real-Time Collaboration (SSE)</w:t>
             </w:r>
           </w:p>
         </w:tc>
@@ -4995,7 +5013,7 @@
                 <w:sz w:val="20"/>
                 <w:szCs w:val="20"/>
               </w:rPr>
-              <w:t xml:space="preserve">Link commits, pull requests, and branches to JedForge issues.</w:t>
+              <w:t xml:space="preserve">Currently implemented as polling via AutoRefresh component (3-minute interval). Full SSE implementation is planned. See Section 7.</w:t>
             </w:r>
           </w:p>
         </w:tc>
@@ -5034,7 +5052,7 @@
                 <w:sz w:val="20"/>
                 <w:szCs w:val="20"/>
               </w:rPr>
-              <w:t xml:space="preserve">Webhook Support (Outbound)</w:t>
+              <w:t xml:space="preserve">Email Notifications</w:t>
             </w:r>
           </w:p>
         </w:tc>
@@ -5108,7 +5126,7 @@
                 <w:sz w:val="20"/>
                 <w:szCs w:val="20"/>
               </w:rPr>
-              <w:t xml:space="preserve">Fire outbound webhooks on configurable events for third-party integrations.</w:t>
+              <w:t xml:space="preserve">Outbound email for assignments, mentions, and due date reminders. Email provider not yet selected.</w:t>
             </w:r>
           </w:p>
         </w:tc>
@@ -5147,7 +5165,7 @@
                 <w:sz w:val="20"/>
                 <w:szCs w:val="20"/>
               </w:rPr>
-              <w:t xml:space="preserve">Import / Export</w:t>
+              <w:t xml:space="preserve">In-App Notifications</w:t>
             </w:r>
           </w:p>
         </w:tc>
@@ -5221,7 +5239,1024 @@
                 <w:sz w:val="20"/>
                 <w:szCs w:val="20"/>
               </w:rPr>
+              <w:t xml:space="preserve">Not yet built. Notification model, delivery system, and bell UI all need implementation.</w:t>
+            </w:r>
+          </w:p>
+        </w:tc>
+      </w:tr>
+      <w:tr>
+        <w:tc>
+          <w:tcPr>
+            <w:tcW w:type="dxa" w:w="3200"/>
+            <w:tcBorders>
+              <w:top w:val="single" w:color="E2E8F0" w:sz="1"/>
+              <w:left w:val="single" w:color="E2E8F0" w:sz="1"/>
+              <w:bottom w:val="single" w:color="E2E8F0" w:sz="1"/>
+              <w:right w:val="single" w:color="E2E8F0" w:sz="1"/>
+            </w:tcBorders>
+            <w:shd w:fill="F8F9FA" w:val="clear"/>
+            <w:tcMar>
+              <w:top w:type="dxa" w:w="100"/>
+              <w:left w:type="dxa" w:w="140"/>
+              <w:bottom w:type="dxa" w:w="100"/>
+              <w:right w:type="dxa" w:w="140"/>
+            </w:tcMar>
+            <w:vAlign w:val="top"/>
+          </w:tcPr>
+          <w:p>
+            <w:pPr>
+              <w:spacing w:after="0" w:before="0"/>
+            </w:pPr>
+            <w:r>
+              <w:rPr>
+                <w:rFonts w:ascii="Arial" w:cs="Arial" w:eastAsia="Arial" w:hAnsi="Arial"/>
+                <w:b/>
+                <w:bCs/>
+                <w:i w:val="false"/>
+                <w:iCs w:val="false"/>
+                <w:color w:val="1F232B"/>
+                <w:sz w:val="20"/>
+                <w:szCs w:val="20"/>
+              </w:rPr>
+              <w:t xml:space="preserve">GitHub OAuth</w:t>
+            </w:r>
+          </w:p>
+        </w:tc>
+        <w:tc>
+          <w:tcPr>
+            <w:tcW w:type="dxa" w:w="1800"/>
+            <w:tcBorders>
+              <w:top w:val="single" w:color="E2E8F0" w:sz="1"/>
+              <w:left w:val="single" w:color="E2E8F0" w:sz="1"/>
+              <w:bottom w:val="single" w:color="E2E8F0" w:sz="1"/>
+              <w:right w:val="single" w:color="E2E8F0" w:sz="1"/>
+            </w:tcBorders>
+            <w:shd w:fill="F8F9FA" w:val="clear"/>
+            <w:tcMar>
+              <w:top w:type="dxa" w:w="100"/>
+              <w:left w:type="dxa" w:w="140"/>
+              <w:bottom w:type="dxa" w:w="100"/>
+              <w:right w:type="dxa" w:w="140"/>
+            </w:tcMar>
+            <w:vAlign w:val="top"/>
+          </w:tcPr>
+          <w:p>
+            <w:pPr>
+              <w:spacing w:after="0" w:before="0"/>
+            </w:pPr>
+            <w:r>
+              <w:rPr>
+                <w:rFonts w:ascii="Arial" w:cs="Arial" w:eastAsia="Arial" w:hAnsi="Arial"/>
+                <w:b w:val="false"/>
+                <w:bCs w:val="false"/>
+                <w:i w:val="false"/>
+                <w:iCs w:val="false"/>
+                <w:color w:val="92400E"/>
+                <w:sz w:val="20"/>
+                <w:szCs w:val="20"/>
+              </w:rPr>
+              <w:t xml:space="preserve">Planned</w:t>
+            </w:r>
+          </w:p>
+        </w:tc>
+        <w:tc>
+          <w:tcPr>
+            <w:tcW w:type="dxa" w:w="4360"/>
+            <w:tcBorders>
+              <w:top w:val="single" w:color="E2E8F0" w:sz="1"/>
+              <w:left w:val="single" w:color="E2E8F0" w:sz="1"/>
+              <w:bottom w:val="single" w:color="E2E8F0" w:sz="1"/>
+              <w:right w:val="single" w:color="E2E8F0" w:sz="1"/>
+            </w:tcBorders>
+            <w:shd w:fill="F8F9FA" w:val="clear"/>
+            <w:tcMar>
+              <w:top w:type="dxa" w:w="100"/>
+              <w:left w:type="dxa" w:w="140"/>
+              <w:bottom w:type="dxa" w:w="100"/>
+              <w:right w:type="dxa" w:w="140"/>
+            </w:tcMar>
+            <w:vAlign w:val="top"/>
+          </w:tcPr>
+          <w:p>
+            <w:pPr>
+              <w:spacing w:after="0" w:before="0"/>
+            </w:pPr>
+            <w:r>
+              <w:rPr>
+                <w:rFonts w:ascii="Arial" w:cs="Arial" w:eastAsia="Arial" w:hAnsi="Arial"/>
+                <w:b w:val="false"/>
+                <w:bCs w:val="false"/>
+                <w:i w:val="false"/>
+                <w:iCs w:val="false"/>
+                <w:color w:val="1F232B"/>
+                <w:sz w:val="20"/>
+                <w:szCs w:val="20"/>
+              </w:rPr>
+              <w:t xml:space="preserve">Not yet implemented. Only Credentials login is active. GitHub provider needs to be added to auth.ts.</w:t>
+            </w:r>
+          </w:p>
+        </w:tc>
+      </w:tr>
+      <w:tr>
+        <w:tc>
+          <w:tcPr>
+            <w:tcW w:type="dxa" w:w="3200"/>
+            <w:tcBorders>
+              <w:top w:val="single" w:color="E2E8F0" w:sz="1"/>
+              <w:left w:val="single" w:color="E2E8F0" w:sz="1"/>
+              <w:bottom w:val="single" w:color="E2E8F0" w:sz="1"/>
+              <w:right w:val="single" w:color="E2E8F0" w:sz="1"/>
+            </w:tcBorders>
+            <w:shd w:fill="FFFFFF" w:val="clear"/>
+            <w:tcMar>
+              <w:top w:type="dxa" w:w="100"/>
+              <w:left w:type="dxa" w:w="140"/>
+              <w:bottom w:type="dxa" w:w="100"/>
+              <w:right w:type="dxa" w:w="140"/>
+            </w:tcMar>
+            <w:vAlign w:val="top"/>
+          </w:tcPr>
+          <w:p>
+            <w:pPr>
+              <w:spacing w:after="0" w:before="0"/>
+            </w:pPr>
+            <w:r>
+              <w:rPr>
+                <w:rFonts w:ascii="Arial" w:cs="Arial" w:eastAsia="Arial" w:hAnsi="Arial"/>
+                <w:b/>
+                <w:bCs/>
+                <w:i w:val="false"/>
+                <w:iCs w:val="false"/>
+                <w:color w:val="1F232B"/>
+                <w:sz w:val="20"/>
+                <w:szCs w:val="20"/>
+              </w:rPr>
+              <w:t xml:space="preserve">GitHub (Issue Linking)</w:t>
+            </w:r>
+          </w:p>
+        </w:tc>
+        <w:tc>
+          <w:tcPr>
+            <w:tcW w:type="dxa" w:w="1800"/>
+            <w:tcBorders>
+              <w:top w:val="single" w:color="E2E8F0" w:sz="1"/>
+              <w:left w:val="single" w:color="E2E8F0" w:sz="1"/>
+              <w:bottom w:val="single" w:color="E2E8F0" w:sz="1"/>
+              <w:right w:val="single" w:color="E2E8F0" w:sz="1"/>
+            </w:tcBorders>
+            <w:shd w:fill="FFFFFF" w:val="clear"/>
+            <w:tcMar>
+              <w:top w:type="dxa" w:w="100"/>
+              <w:left w:type="dxa" w:w="140"/>
+              <w:bottom w:type="dxa" w:w="100"/>
+              <w:right w:type="dxa" w:w="140"/>
+            </w:tcMar>
+            <w:vAlign w:val="top"/>
+          </w:tcPr>
+          <w:p>
+            <w:pPr>
+              <w:spacing w:after="0" w:before="0"/>
+            </w:pPr>
+            <w:r>
+              <w:rPr>
+                <w:rFonts w:ascii="Arial" w:cs="Arial" w:eastAsia="Arial" w:hAnsi="Arial"/>
+                <w:b w:val="false"/>
+                <w:bCs w:val="false"/>
+                <w:i w:val="false"/>
+                <w:iCs w:val="false"/>
+                <w:color w:val="92400E"/>
+                <w:sz w:val="20"/>
+                <w:szCs w:val="20"/>
+              </w:rPr>
+              <w:t xml:space="preserve">Planned</w:t>
+            </w:r>
+          </w:p>
+        </w:tc>
+        <w:tc>
+          <w:tcPr>
+            <w:tcW w:type="dxa" w:w="4360"/>
+            <w:tcBorders>
+              <w:top w:val="single" w:color="E2E8F0" w:sz="1"/>
+              <w:left w:val="single" w:color="E2E8F0" w:sz="1"/>
+              <w:bottom w:val="single" w:color="E2E8F0" w:sz="1"/>
+              <w:right w:val="single" w:color="E2E8F0" w:sz="1"/>
+            </w:tcBorders>
+            <w:shd w:fill="FFFFFF" w:val="clear"/>
+            <w:tcMar>
+              <w:top w:type="dxa" w:w="100"/>
+              <w:left w:type="dxa" w:w="140"/>
+              <w:bottom w:type="dxa" w:w="100"/>
+              <w:right w:type="dxa" w:w="140"/>
+            </w:tcMar>
+            <w:vAlign w:val="top"/>
+          </w:tcPr>
+          <w:p>
+            <w:pPr>
+              <w:spacing w:after="0" w:before="0"/>
+            </w:pPr>
+            <w:r>
+              <w:rPr>
+                <w:rFonts w:ascii="Arial" w:cs="Arial" w:eastAsia="Arial" w:hAnsi="Arial"/>
+                <w:b w:val="false"/>
+                <w:bCs w:val="false"/>
+                <w:i w:val="false"/>
+                <w:iCs w:val="false"/>
+                <w:color w:val="1F232B"/>
+                <w:sz w:val="20"/>
+                <w:szCs w:val="20"/>
+              </w:rPr>
+              <w:t xml:space="preserve">Link commits, pull requests, and branches to JedForge issues.</w:t>
+            </w:r>
+          </w:p>
+        </w:tc>
+      </w:tr>
+      <w:tr>
+        <w:tc>
+          <w:tcPr>
+            <w:tcW w:type="dxa" w:w="3200"/>
+            <w:tcBorders>
+              <w:top w:val="single" w:color="E2E8F0" w:sz="1"/>
+              <w:left w:val="single" w:color="E2E8F0" w:sz="1"/>
+              <w:bottom w:val="single" w:color="E2E8F0" w:sz="1"/>
+              <w:right w:val="single" w:color="E2E8F0" w:sz="1"/>
+            </w:tcBorders>
+            <w:shd w:fill="F8F9FA" w:val="clear"/>
+            <w:tcMar>
+              <w:top w:type="dxa" w:w="100"/>
+              <w:left w:type="dxa" w:w="140"/>
+              <w:bottom w:type="dxa" w:w="100"/>
+              <w:right w:type="dxa" w:w="140"/>
+            </w:tcMar>
+            <w:vAlign w:val="top"/>
+          </w:tcPr>
+          <w:p>
+            <w:pPr>
+              <w:spacing w:after="0" w:before="0"/>
+            </w:pPr>
+            <w:r>
+              <w:rPr>
+                <w:rFonts w:ascii="Arial" w:cs="Arial" w:eastAsia="Arial" w:hAnsi="Arial"/>
+                <w:b/>
+                <w:bCs/>
+                <w:i w:val="false"/>
+                <w:iCs w:val="false"/>
+                <w:color w:val="1F232B"/>
+                <w:sz w:val="20"/>
+                <w:szCs w:val="20"/>
+              </w:rPr>
+              <w:t xml:space="preserve">Sprints / Iterations</w:t>
+            </w:r>
+          </w:p>
+        </w:tc>
+        <w:tc>
+          <w:tcPr>
+            <w:tcW w:type="dxa" w:w="1800"/>
+            <w:tcBorders>
+              <w:top w:val="single" w:color="E2E8F0" w:sz="1"/>
+              <w:left w:val="single" w:color="E2E8F0" w:sz="1"/>
+              <w:bottom w:val="single" w:color="E2E8F0" w:sz="1"/>
+              <w:right w:val="single" w:color="E2E8F0" w:sz="1"/>
+            </w:tcBorders>
+            <w:shd w:fill="F8F9FA" w:val="clear"/>
+            <w:tcMar>
+              <w:top w:type="dxa" w:w="100"/>
+              <w:left w:type="dxa" w:w="140"/>
+              <w:bottom w:type="dxa" w:w="100"/>
+              <w:right w:type="dxa" w:w="140"/>
+            </w:tcMar>
+            <w:vAlign w:val="top"/>
+          </w:tcPr>
+          <w:p>
+            <w:pPr>
+              <w:spacing w:after="0" w:before="0"/>
+            </w:pPr>
+            <w:r>
+              <w:rPr>
+                <w:rFonts w:ascii="Arial" w:cs="Arial" w:eastAsia="Arial" w:hAnsi="Arial"/>
+                <w:b w:val="false"/>
+                <w:bCs w:val="false"/>
+                <w:i w:val="false"/>
+                <w:iCs w:val="false"/>
+                <w:color w:val="92400E"/>
+                <w:sz w:val="20"/>
+                <w:szCs w:val="20"/>
+              </w:rPr>
+              <w:t xml:space="preserve">Planned</w:t>
+            </w:r>
+          </w:p>
+        </w:tc>
+        <w:tc>
+          <w:tcPr>
+            <w:tcW w:type="dxa" w:w="4360"/>
+            <w:tcBorders>
+              <w:top w:val="single" w:color="E2E8F0" w:sz="1"/>
+              <w:left w:val="single" w:color="E2E8F0" w:sz="1"/>
+              <w:bottom w:val="single" w:color="E2E8F0" w:sz="1"/>
+              <w:right w:val="single" w:color="E2E8F0" w:sz="1"/>
+            </w:tcBorders>
+            <w:shd w:fill="F8F9FA" w:val="clear"/>
+            <w:tcMar>
+              <w:top w:type="dxa" w:w="100"/>
+              <w:left w:type="dxa" w:w="140"/>
+              <w:bottom w:type="dxa" w:w="100"/>
+              <w:right w:type="dxa" w:w="140"/>
+            </w:tcMar>
+            <w:vAlign w:val="top"/>
+          </w:tcPr>
+          <w:p>
+            <w:pPr>
+              <w:spacing w:after="0" w:before="0"/>
+            </w:pPr>
+            <w:r>
+              <w:rPr>
+                <w:rFonts w:ascii="Arial" w:cs="Arial" w:eastAsia="Arial" w:hAnsi="Arial"/>
+                <w:b w:val="false"/>
+                <w:bCs w:val="false"/>
+                <w:i w:val="false"/>
+                <w:iCs w:val="false"/>
+                <w:color w:val="1F232B"/>
+                <w:sz w:val="20"/>
+                <w:szCs w:val="20"/>
+              </w:rPr>
+              <w:t xml:space="preserve">Time-boxed sprints scoped to a project with backlog management.</w:t>
+            </w:r>
+          </w:p>
+        </w:tc>
+      </w:tr>
+      <w:tr>
+        <w:tc>
+          <w:tcPr>
+            <w:tcW w:type="dxa" w:w="3200"/>
+            <w:tcBorders>
+              <w:top w:val="single" w:color="E2E8F0" w:sz="1"/>
+              <w:left w:val="single" w:color="E2E8F0" w:sz="1"/>
+              <w:bottom w:val="single" w:color="E2E8F0" w:sz="1"/>
+              <w:right w:val="single" w:color="E2E8F0" w:sz="1"/>
+            </w:tcBorders>
+            <w:shd w:fill="FFFFFF" w:val="clear"/>
+            <w:tcMar>
+              <w:top w:type="dxa" w:w="100"/>
+              <w:left w:type="dxa" w:w="140"/>
+              <w:bottom w:type="dxa" w:w="100"/>
+              <w:right w:type="dxa" w:w="140"/>
+            </w:tcMar>
+            <w:vAlign w:val="top"/>
+          </w:tcPr>
+          <w:p>
+            <w:pPr>
+              <w:spacing w:after="0" w:before="0"/>
+            </w:pPr>
+            <w:r>
+              <w:rPr>
+                <w:rFonts w:ascii="Arial" w:cs="Arial" w:eastAsia="Arial" w:hAnsi="Arial"/>
+                <w:b/>
+                <w:bCs/>
+                <w:i w:val="false"/>
+                <w:iCs w:val="false"/>
+                <w:color w:val="1F232B"/>
+                <w:sz w:val="20"/>
+                <w:szCs w:val="20"/>
+              </w:rPr>
+              <w:t xml:space="preserve">Milestones</w:t>
+            </w:r>
+          </w:p>
+        </w:tc>
+        <w:tc>
+          <w:tcPr>
+            <w:tcW w:type="dxa" w:w="1800"/>
+            <w:tcBorders>
+              <w:top w:val="single" w:color="E2E8F0" w:sz="1"/>
+              <w:left w:val="single" w:color="E2E8F0" w:sz="1"/>
+              <w:bottom w:val="single" w:color="E2E8F0" w:sz="1"/>
+              <w:right w:val="single" w:color="E2E8F0" w:sz="1"/>
+            </w:tcBorders>
+            <w:shd w:fill="FFFFFF" w:val="clear"/>
+            <w:tcMar>
+              <w:top w:type="dxa" w:w="100"/>
+              <w:left w:type="dxa" w:w="140"/>
+              <w:bottom w:type="dxa" w:w="100"/>
+              <w:right w:type="dxa" w:w="140"/>
+            </w:tcMar>
+            <w:vAlign w:val="top"/>
+          </w:tcPr>
+          <w:p>
+            <w:pPr>
+              <w:spacing w:after="0" w:before="0"/>
+            </w:pPr>
+            <w:r>
+              <w:rPr>
+                <w:rFonts w:ascii="Arial" w:cs="Arial" w:eastAsia="Arial" w:hAnsi="Arial"/>
+                <w:b w:val="false"/>
+                <w:bCs w:val="false"/>
+                <w:i w:val="false"/>
+                <w:iCs w:val="false"/>
+                <w:color w:val="92400E"/>
+                <w:sz w:val="20"/>
+                <w:szCs w:val="20"/>
+              </w:rPr>
+              <w:t xml:space="preserve">Planned</w:t>
+            </w:r>
+          </w:p>
+        </w:tc>
+        <w:tc>
+          <w:tcPr>
+            <w:tcW w:type="dxa" w:w="4360"/>
+            <w:tcBorders>
+              <w:top w:val="single" w:color="E2E8F0" w:sz="1"/>
+              <w:left w:val="single" w:color="E2E8F0" w:sz="1"/>
+              <w:bottom w:val="single" w:color="E2E8F0" w:sz="1"/>
+              <w:right w:val="single" w:color="E2E8F0" w:sz="1"/>
+            </w:tcBorders>
+            <w:shd w:fill="FFFFFF" w:val="clear"/>
+            <w:tcMar>
+              <w:top w:type="dxa" w:w="100"/>
+              <w:left w:type="dxa" w:w="140"/>
+              <w:bottom w:type="dxa" w:w="100"/>
+              <w:right w:type="dxa" w:w="140"/>
+            </w:tcMar>
+            <w:vAlign w:val="top"/>
+          </w:tcPr>
+          <w:p>
+            <w:pPr>
+              <w:spacing w:after="0" w:before="0"/>
+            </w:pPr>
+            <w:r>
+              <w:rPr>
+                <w:rFonts w:ascii="Arial" w:cs="Arial" w:eastAsia="Arial" w:hAnsi="Arial"/>
+                <w:b w:val="false"/>
+                <w:bCs w:val="false"/>
+                <w:i w:val="false"/>
+                <w:iCs w:val="false"/>
+                <w:color w:val="1F232B"/>
+                <w:sz w:val="20"/>
+                <w:szCs w:val="20"/>
+              </w:rPr>
+              <w:t xml:space="preserve">Named milestones with due dates that issues can be associated with.</w:t>
+            </w:r>
+          </w:p>
+        </w:tc>
+      </w:tr>
+      <w:tr>
+        <w:tc>
+          <w:tcPr>
+            <w:tcW w:type="dxa" w:w="3200"/>
+            <w:tcBorders>
+              <w:top w:val="single" w:color="E2E8F0" w:sz="1"/>
+              <w:left w:val="single" w:color="E2E8F0" w:sz="1"/>
+              <w:bottom w:val="single" w:color="E2E8F0" w:sz="1"/>
+              <w:right w:val="single" w:color="E2E8F0" w:sz="1"/>
+            </w:tcBorders>
+            <w:shd w:fill="F8F9FA" w:val="clear"/>
+            <w:tcMar>
+              <w:top w:type="dxa" w:w="100"/>
+              <w:left w:type="dxa" w:w="140"/>
+              <w:bottom w:type="dxa" w:w="100"/>
+              <w:right w:type="dxa" w:w="140"/>
+            </w:tcMar>
+            <w:vAlign w:val="top"/>
+          </w:tcPr>
+          <w:p>
+            <w:pPr>
+              <w:spacing w:after="0" w:before="0"/>
+            </w:pPr>
+            <w:r>
+              <w:rPr>
+                <w:rFonts w:ascii="Arial" w:cs="Arial" w:eastAsia="Arial" w:hAnsi="Arial"/>
+                <w:b/>
+                <w:bCs/>
+                <w:i w:val="false"/>
+                <w:iCs w:val="false"/>
+                <w:color w:val="1F232B"/>
+                <w:sz w:val="20"/>
+                <w:szCs w:val="20"/>
+              </w:rPr>
+              <w:t xml:space="preserve">Roadmap / Timeline (Gantt)</w:t>
+            </w:r>
+          </w:p>
+        </w:tc>
+        <w:tc>
+          <w:tcPr>
+            <w:tcW w:type="dxa" w:w="1800"/>
+            <w:tcBorders>
+              <w:top w:val="single" w:color="E2E8F0" w:sz="1"/>
+              <w:left w:val="single" w:color="E2E8F0" w:sz="1"/>
+              <w:bottom w:val="single" w:color="E2E8F0" w:sz="1"/>
+              <w:right w:val="single" w:color="E2E8F0" w:sz="1"/>
+            </w:tcBorders>
+            <w:shd w:fill="F8F9FA" w:val="clear"/>
+            <w:tcMar>
+              <w:top w:type="dxa" w:w="100"/>
+              <w:left w:type="dxa" w:w="140"/>
+              <w:bottom w:type="dxa" w:w="100"/>
+              <w:right w:type="dxa" w:w="140"/>
+            </w:tcMar>
+            <w:vAlign w:val="top"/>
+          </w:tcPr>
+          <w:p>
+            <w:pPr>
+              <w:spacing w:after="0" w:before="0"/>
+            </w:pPr>
+            <w:r>
+              <w:rPr>
+                <w:rFonts w:ascii="Arial" w:cs="Arial" w:eastAsia="Arial" w:hAnsi="Arial"/>
+                <w:b w:val="false"/>
+                <w:bCs w:val="false"/>
+                <w:i w:val="false"/>
+                <w:iCs w:val="false"/>
+                <w:color w:val="92400E"/>
+                <w:sz w:val="20"/>
+                <w:szCs w:val="20"/>
+              </w:rPr>
+              <w:t xml:space="preserve">Planned</w:t>
+            </w:r>
+          </w:p>
+        </w:tc>
+        <w:tc>
+          <w:tcPr>
+            <w:tcW w:type="dxa" w:w="4360"/>
+            <w:tcBorders>
+              <w:top w:val="single" w:color="E2E8F0" w:sz="1"/>
+              <w:left w:val="single" w:color="E2E8F0" w:sz="1"/>
+              <w:bottom w:val="single" w:color="E2E8F0" w:sz="1"/>
+              <w:right w:val="single" w:color="E2E8F0" w:sz="1"/>
+            </w:tcBorders>
+            <w:shd w:fill="F8F9FA" w:val="clear"/>
+            <w:tcMar>
+              <w:top w:type="dxa" w:w="100"/>
+              <w:left w:type="dxa" w:w="140"/>
+              <w:bottom w:type="dxa" w:w="100"/>
+              <w:right w:type="dxa" w:w="140"/>
+            </w:tcMar>
+            <w:vAlign w:val="top"/>
+          </w:tcPr>
+          <w:p>
+            <w:pPr>
+              <w:spacing w:after="0" w:before="0"/>
+            </w:pPr>
+            <w:r>
+              <w:rPr>
+                <w:rFonts w:ascii="Arial" w:cs="Arial" w:eastAsia="Arial" w:hAnsi="Arial"/>
+                <w:b w:val="false"/>
+                <w:bCs w:val="false"/>
+                <w:i w:val="false"/>
+                <w:iCs w:val="false"/>
+                <w:color w:val="1F232B"/>
+                <w:sz w:val="20"/>
+                <w:szCs w:val="20"/>
+              </w:rPr>
+              <w:t xml:space="preserve">Visual timeline view of milestones and epics across a project.</w:t>
+            </w:r>
+          </w:p>
+        </w:tc>
+      </w:tr>
+      <w:tr>
+        <w:tc>
+          <w:tcPr>
+            <w:tcW w:type="dxa" w:w="3200"/>
+            <w:tcBorders>
+              <w:top w:val="single" w:color="E2E8F0" w:sz="1"/>
+              <w:left w:val="single" w:color="E2E8F0" w:sz="1"/>
+              <w:bottom w:val="single" w:color="E2E8F0" w:sz="1"/>
+              <w:right w:val="single" w:color="E2E8F0" w:sz="1"/>
+            </w:tcBorders>
+            <w:shd w:fill="FFFFFF" w:val="clear"/>
+            <w:tcMar>
+              <w:top w:type="dxa" w:w="100"/>
+              <w:left w:type="dxa" w:w="140"/>
+              <w:bottom w:type="dxa" w:w="100"/>
+              <w:right w:type="dxa" w:w="140"/>
+            </w:tcMar>
+            <w:vAlign w:val="top"/>
+          </w:tcPr>
+          <w:p>
+            <w:pPr>
+              <w:spacing w:after="0" w:before="0"/>
+            </w:pPr>
+            <w:r>
+              <w:rPr>
+                <w:rFonts w:ascii="Arial" w:cs="Arial" w:eastAsia="Arial" w:hAnsi="Arial"/>
+                <w:b/>
+                <w:bCs/>
+                <w:i w:val="false"/>
+                <w:iCs w:val="false"/>
+                <w:color w:val="1F232B"/>
+                <w:sz w:val="20"/>
+                <w:szCs w:val="20"/>
+              </w:rPr>
+              <w:t xml:space="preserve">Dashboard / Analytics</w:t>
+            </w:r>
+          </w:p>
+        </w:tc>
+        <w:tc>
+          <w:tcPr>
+            <w:tcW w:type="dxa" w:w="1800"/>
+            <w:tcBorders>
+              <w:top w:val="single" w:color="E2E8F0" w:sz="1"/>
+              <w:left w:val="single" w:color="E2E8F0" w:sz="1"/>
+              <w:bottom w:val="single" w:color="E2E8F0" w:sz="1"/>
+              <w:right w:val="single" w:color="E2E8F0" w:sz="1"/>
+            </w:tcBorders>
+            <w:shd w:fill="FFFFFF" w:val="clear"/>
+            <w:tcMar>
+              <w:top w:type="dxa" w:w="100"/>
+              <w:left w:type="dxa" w:w="140"/>
+              <w:bottom w:type="dxa" w:w="100"/>
+              <w:right w:type="dxa" w:w="140"/>
+            </w:tcMar>
+            <w:vAlign w:val="top"/>
+          </w:tcPr>
+          <w:p>
+            <w:pPr>
+              <w:spacing w:after="0" w:before="0"/>
+            </w:pPr>
+            <w:r>
+              <w:rPr>
+                <w:rFonts w:ascii="Arial" w:cs="Arial" w:eastAsia="Arial" w:hAnsi="Arial"/>
+                <w:b w:val="false"/>
+                <w:bCs w:val="false"/>
+                <w:i w:val="false"/>
+                <w:iCs w:val="false"/>
+                <w:color w:val="92400E"/>
+                <w:sz w:val="20"/>
+                <w:szCs w:val="20"/>
+              </w:rPr>
+              <w:t xml:space="preserve">Planned</w:t>
+            </w:r>
+          </w:p>
+        </w:tc>
+        <w:tc>
+          <w:tcPr>
+            <w:tcW w:type="dxa" w:w="4360"/>
+            <w:tcBorders>
+              <w:top w:val="single" w:color="E2E8F0" w:sz="1"/>
+              <w:left w:val="single" w:color="E2E8F0" w:sz="1"/>
+              <w:bottom w:val="single" w:color="E2E8F0" w:sz="1"/>
+              <w:right w:val="single" w:color="E2E8F0" w:sz="1"/>
+            </w:tcBorders>
+            <w:shd w:fill="FFFFFF" w:val="clear"/>
+            <w:tcMar>
+              <w:top w:type="dxa" w:w="100"/>
+              <w:left w:type="dxa" w:w="140"/>
+              <w:bottom w:type="dxa" w:w="100"/>
+              <w:right w:type="dxa" w:w="140"/>
+            </w:tcMar>
+            <w:vAlign w:val="top"/>
+          </w:tcPr>
+          <w:p>
+            <w:pPr>
+              <w:spacing w:after="0" w:before="0"/>
+            </w:pPr>
+            <w:r>
+              <w:rPr>
+                <w:rFonts w:ascii="Arial" w:cs="Arial" w:eastAsia="Arial" w:hAnsi="Arial"/>
+                <w:b w:val="false"/>
+                <w:bCs w:val="false"/>
+                <w:i w:val="false"/>
+                <w:iCs w:val="false"/>
+                <w:color w:val="1F232B"/>
+                <w:sz w:val="20"/>
+                <w:szCs w:val="20"/>
+              </w:rPr>
+              <w:t xml:space="preserve">Summary view showing open issues, velocity, burndown, and team workload.</w:t>
+            </w:r>
+          </w:p>
+        </w:tc>
+      </w:tr>
+      <w:tr>
+        <w:tc>
+          <w:tcPr>
+            <w:tcW w:type="dxa" w:w="3200"/>
+            <w:tcBorders>
+              <w:top w:val="single" w:color="E2E8F0" w:sz="1"/>
+              <w:left w:val="single" w:color="E2E8F0" w:sz="1"/>
+              <w:bottom w:val="single" w:color="E2E8F0" w:sz="1"/>
+              <w:right w:val="single" w:color="E2E8F0" w:sz="1"/>
+            </w:tcBorders>
+            <w:shd w:fill="F8F9FA" w:val="clear"/>
+            <w:tcMar>
+              <w:top w:type="dxa" w:w="100"/>
+              <w:left w:type="dxa" w:w="140"/>
+              <w:bottom w:type="dxa" w:w="100"/>
+              <w:right w:type="dxa" w:w="140"/>
+            </w:tcMar>
+            <w:vAlign w:val="top"/>
+          </w:tcPr>
+          <w:p>
+            <w:pPr>
+              <w:spacing w:after="0" w:before="0"/>
+            </w:pPr>
+            <w:r>
+              <w:rPr>
+                <w:rFonts w:ascii="Arial" w:cs="Arial" w:eastAsia="Arial" w:hAnsi="Arial"/>
+                <w:b/>
+                <w:bCs/>
+                <w:i w:val="false"/>
+                <w:iCs w:val="false"/>
+                <w:color w:val="1F232B"/>
+                <w:sz w:val="20"/>
+                <w:szCs w:val="20"/>
+              </w:rPr>
+              <w:t xml:space="preserve">Webhook Support (Outbound)</w:t>
+            </w:r>
+          </w:p>
+        </w:tc>
+        <w:tc>
+          <w:tcPr>
+            <w:tcW w:type="dxa" w:w="1800"/>
+            <w:tcBorders>
+              <w:top w:val="single" w:color="E2E8F0" w:sz="1"/>
+              <w:left w:val="single" w:color="E2E8F0" w:sz="1"/>
+              <w:bottom w:val="single" w:color="E2E8F0" w:sz="1"/>
+              <w:right w:val="single" w:color="E2E8F0" w:sz="1"/>
+            </w:tcBorders>
+            <w:shd w:fill="F8F9FA" w:val="clear"/>
+            <w:tcMar>
+              <w:top w:type="dxa" w:w="100"/>
+              <w:left w:type="dxa" w:w="140"/>
+              <w:bottom w:type="dxa" w:w="100"/>
+              <w:right w:type="dxa" w:w="140"/>
+            </w:tcMar>
+            <w:vAlign w:val="top"/>
+          </w:tcPr>
+          <w:p>
+            <w:pPr>
+              <w:spacing w:after="0" w:before="0"/>
+            </w:pPr>
+            <w:r>
+              <w:rPr>
+                <w:rFonts w:ascii="Arial" w:cs="Arial" w:eastAsia="Arial" w:hAnsi="Arial"/>
+                <w:b w:val="false"/>
+                <w:bCs w:val="false"/>
+                <w:i w:val="false"/>
+                <w:iCs w:val="false"/>
+                <w:color w:val="92400E"/>
+                <w:sz w:val="20"/>
+                <w:szCs w:val="20"/>
+              </w:rPr>
+              <w:t xml:space="preserve">Planned</w:t>
+            </w:r>
+          </w:p>
+        </w:tc>
+        <w:tc>
+          <w:tcPr>
+            <w:tcW w:type="dxa" w:w="4360"/>
+            <w:tcBorders>
+              <w:top w:val="single" w:color="E2E8F0" w:sz="1"/>
+              <w:left w:val="single" w:color="E2E8F0" w:sz="1"/>
+              <w:bottom w:val="single" w:color="E2E8F0" w:sz="1"/>
+              <w:right w:val="single" w:color="E2E8F0" w:sz="1"/>
+            </w:tcBorders>
+            <w:shd w:fill="F8F9FA" w:val="clear"/>
+            <w:tcMar>
+              <w:top w:type="dxa" w:w="100"/>
+              <w:left w:type="dxa" w:w="140"/>
+              <w:bottom w:type="dxa" w:w="100"/>
+              <w:right w:type="dxa" w:w="140"/>
+            </w:tcMar>
+            <w:vAlign w:val="top"/>
+          </w:tcPr>
+          <w:p>
+            <w:pPr>
+              <w:spacing w:after="0" w:before="0"/>
+            </w:pPr>
+            <w:r>
+              <w:rPr>
+                <w:rFonts w:ascii="Arial" w:cs="Arial" w:eastAsia="Arial" w:hAnsi="Arial"/>
+                <w:b w:val="false"/>
+                <w:bCs w:val="false"/>
+                <w:i w:val="false"/>
+                <w:iCs w:val="false"/>
+                <w:color w:val="1F232B"/>
+                <w:sz w:val="20"/>
+                <w:szCs w:val="20"/>
+              </w:rPr>
+              <w:t xml:space="preserve">Admin-configurable outbound webhooks triggered by issue events.</w:t>
+            </w:r>
+          </w:p>
+        </w:tc>
+      </w:tr>
+      <w:tr>
+        <w:tc>
+          <w:tcPr>
+            <w:tcW w:type="dxa" w:w="3200"/>
+            <w:tcBorders>
+              <w:top w:val="single" w:color="E2E8F0" w:sz="1"/>
+              <w:left w:val="single" w:color="E2E8F0" w:sz="1"/>
+              <w:bottom w:val="single" w:color="E2E8F0" w:sz="1"/>
+              <w:right w:val="single" w:color="E2E8F0" w:sz="1"/>
+            </w:tcBorders>
+            <w:shd w:fill="FFFFFF" w:val="clear"/>
+            <w:tcMar>
+              <w:top w:type="dxa" w:w="100"/>
+              <w:left w:type="dxa" w:w="140"/>
+              <w:bottom w:type="dxa" w:w="100"/>
+              <w:right w:type="dxa" w:w="140"/>
+            </w:tcMar>
+            <w:vAlign w:val="top"/>
+          </w:tcPr>
+          <w:p>
+            <w:pPr>
+              <w:spacing w:after="0" w:before="0"/>
+            </w:pPr>
+            <w:r>
+              <w:rPr>
+                <w:rFonts w:ascii="Arial" w:cs="Arial" w:eastAsia="Arial" w:hAnsi="Arial"/>
+                <w:b/>
+                <w:bCs/>
+                <w:i w:val="false"/>
+                <w:iCs w:val="false"/>
+                <w:color w:val="1F232B"/>
+                <w:sz w:val="20"/>
+                <w:szCs w:val="20"/>
+              </w:rPr>
+              <w:t xml:space="preserve">Import / Export</w:t>
+            </w:r>
+          </w:p>
+        </w:tc>
+        <w:tc>
+          <w:tcPr>
+            <w:tcW w:type="dxa" w:w="1800"/>
+            <w:tcBorders>
+              <w:top w:val="single" w:color="E2E8F0" w:sz="1"/>
+              <w:left w:val="single" w:color="E2E8F0" w:sz="1"/>
+              <w:bottom w:val="single" w:color="E2E8F0" w:sz="1"/>
+              <w:right w:val="single" w:color="E2E8F0" w:sz="1"/>
+            </w:tcBorders>
+            <w:shd w:fill="FFFFFF" w:val="clear"/>
+            <w:tcMar>
+              <w:top w:type="dxa" w:w="100"/>
+              <w:left w:type="dxa" w:w="140"/>
+              <w:bottom w:type="dxa" w:w="100"/>
+              <w:right w:type="dxa" w:w="140"/>
+            </w:tcMar>
+            <w:vAlign w:val="top"/>
+          </w:tcPr>
+          <w:p>
+            <w:pPr>
+              <w:spacing w:after="0" w:before="0"/>
+            </w:pPr>
+            <w:r>
+              <w:rPr>
+                <w:rFonts w:ascii="Arial" w:cs="Arial" w:eastAsia="Arial" w:hAnsi="Arial"/>
+                <w:b w:val="false"/>
+                <w:bCs w:val="false"/>
+                <w:i w:val="false"/>
+                <w:iCs w:val="false"/>
+                <w:color w:val="92400E"/>
+                <w:sz w:val="20"/>
+                <w:szCs w:val="20"/>
+              </w:rPr>
+              <w:t xml:space="preserve">Planned</w:t>
+            </w:r>
+          </w:p>
+        </w:tc>
+        <w:tc>
+          <w:tcPr>
+            <w:tcW w:type="dxa" w:w="4360"/>
+            <w:tcBorders>
+              <w:top w:val="single" w:color="E2E8F0" w:sz="1"/>
+              <w:left w:val="single" w:color="E2E8F0" w:sz="1"/>
+              <w:bottom w:val="single" w:color="E2E8F0" w:sz="1"/>
+              <w:right w:val="single" w:color="E2E8F0" w:sz="1"/>
+            </w:tcBorders>
+            <w:shd w:fill="FFFFFF" w:val="clear"/>
+            <w:tcMar>
+              <w:top w:type="dxa" w:w="100"/>
+              <w:left w:type="dxa" w:w="140"/>
+              <w:bottom w:type="dxa" w:w="100"/>
+              <w:right w:type="dxa" w:w="140"/>
+            </w:tcMar>
+            <w:vAlign w:val="top"/>
+          </w:tcPr>
+          <w:p>
+            <w:pPr>
+              <w:spacing w:after="0" w:before="0"/>
+            </w:pPr>
+            <w:r>
+              <w:rPr>
+                <w:rFonts w:ascii="Arial" w:cs="Arial" w:eastAsia="Arial" w:hAnsi="Arial"/>
+                <w:b w:val="false"/>
+                <w:bCs w:val="false"/>
+                <w:i w:val="false"/>
+                <w:iCs w:val="false"/>
+                <w:color w:val="1F232B"/>
+                <w:sz w:val="20"/>
+                <w:szCs w:val="20"/>
+              </w:rPr>
               <w:t xml:space="preserve">Import issues from CSV or other tools; export project data.</w:t>
+            </w:r>
+          </w:p>
+        </w:tc>
+      </w:tr>
+      <w:tr>
+        <w:tc>
+          <w:tcPr>
+            <w:tcW w:type="dxa" w:w="3200"/>
+            <w:tcBorders>
+              <w:top w:val="single" w:color="E2E8F0" w:sz="1"/>
+              <w:left w:val="single" w:color="E2E8F0" w:sz="1"/>
+              <w:bottom w:val="single" w:color="E2E8F0" w:sz="1"/>
+              <w:right w:val="single" w:color="E2E8F0" w:sz="1"/>
+            </w:tcBorders>
+            <w:shd w:fill="F8F9FA" w:val="clear"/>
+            <w:tcMar>
+              <w:top w:type="dxa" w:w="100"/>
+              <w:left w:type="dxa" w:w="140"/>
+              <w:bottom w:type="dxa" w:w="100"/>
+              <w:right w:type="dxa" w:w="140"/>
+            </w:tcMar>
+            <w:vAlign w:val="top"/>
+          </w:tcPr>
+          <w:p>
+            <w:pPr>
+              <w:spacing w:after="0" w:before="0"/>
+            </w:pPr>
+            <w:r>
+              <w:rPr>
+                <w:rFonts w:ascii="Arial" w:cs="Arial" w:eastAsia="Arial" w:hAnsi="Arial"/>
+                <w:b/>
+                <w:bCs/>
+                <w:i w:val="false"/>
+                <w:iCs w:val="false"/>
+                <w:color w:val="1F232B"/>
+                <w:sz w:val="20"/>
+                <w:szCs w:val="20"/>
+              </w:rPr>
+              <w:t xml:space="preserve">Project Archive</w:t>
+            </w:r>
+          </w:p>
+        </w:tc>
+        <w:tc>
+          <w:tcPr>
+            <w:tcW w:type="dxa" w:w="1800"/>
+            <w:tcBorders>
+              <w:top w:val="single" w:color="E2E8F0" w:sz="1"/>
+              <w:left w:val="single" w:color="E2E8F0" w:sz="1"/>
+              <w:bottom w:val="single" w:color="E2E8F0" w:sz="1"/>
+              <w:right w:val="single" w:color="E2E8F0" w:sz="1"/>
+            </w:tcBorders>
+            <w:shd w:fill="F8F9FA" w:val="clear"/>
+            <w:tcMar>
+              <w:top w:type="dxa" w:w="100"/>
+              <w:left w:type="dxa" w:w="140"/>
+              <w:bottom w:type="dxa" w:w="100"/>
+              <w:right w:type="dxa" w:w="140"/>
+            </w:tcMar>
+            <w:vAlign w:val="top"/>
+          </w:tcPr>
+          <w:p>
+            <w:pPr>
+              <w:spacing w:after="0" w:before="0"/>
+            </w:pPr>
+            <w:r>
+              <w:rPr>
+                <w:rFonts w:ascii="Arial" w:cs="Arial" w:eastAsia="Arial" w:hAnsi="Arial"/>
+                <w:b w:val="false"/>
+                <w:bCs w:val="false"/>
+                <w:i w:val="false"/>
+                <w:iCs w:val="false"/>
+                <w:color w:val="92400E"/>
+                <w:sz w:val="20"/>
+                <w:szCs w:val="20"/>
+              </w:rPr>
+              <w:t xml:space="preserve">Planned</w:t>
+            </w:r>
+          </w:p>
+        </w:tc>
+        <w:tc>
+          <w:tcPr>
+            <w:tcW w:type="dxa" w:w="4360"/>
+            <w:tcBorders>
+              <w:top w:val="single" w:color="E2E8F0" w:sz="1"/>
+              <w:left w:val="single" w:color="E2E8F0" w:sz="1"/>
+              <w:bottom w:val="single" w:color="E2E8F0" w:sz="1"/>
+              <w:right w:val="single" w:color="E2E8F0" w:sz="1"/>
+            </w:tcBorders>
+            <w:shd w:fill="F8F9FA" w:val="clear"/>
+            <w:tcMar>
+              <w:top w:type="dxa" w:w="100"/>
+              <w:left w:type="dxa" w:w="140"/>
+              <w:bottom w:type="dxa" w:w="100"/>
+              <w:right w:type="dxa" w:w="140"/>
+            </w:tcMar>
+            <w:vAlign w:val="top"/>
+          </w:tcPr>
+          <w:p>
+            <w:pPr>
+              <w:spacing w:after="0" w:before="0"/>
+            </w:pPr>
+            <w:r>
+              <w:rPr>
+                <w:rFonts w:ascii="Arial" w:cs="Arial" w:eastAsia="Arial" w:hAnsi="Arial"/>
+                <w:b w:val="false"/>
+                <w:bCs w:val="false"/>
+                <w:i w:val="false"/>
+                <w:iCs w:val="false"/>
+                <w:color w:val="1F232B"/>
+                <w:sz w:val="20"/>
+                <w:szCs w:val="20"/>
+              </w:rPr>
+              <w:t xml:space="preserve">Archive/unarchive projects. Requires isArchived field on Project model and archive action.</w:t>
             </w:r>
           </w:p>
         </w:tc>
@@ -5320,7 +6355,7 @@
           <w:sz w:val="22"/>
           <w:szCs w:val="22"/>
         </w:rPr>
-        <w:t xml:space="preserve">Description (rich text)</w:t>
+        <w:t xml:space="preserve">Description (rich text via TipTap v2)</w:t>
       </w:r>
     </w:p>
     <w:p>
@@ -5339,7 +6374,7 @@
           <w:sz w:val="22"/>
           <w:szCs w:val="22"/>
         </w:rPr>
-        <w:t xml:space="preserve">Status (Admin-managed, mapped to a system category — see Workflow Model below)</w:t>
+        <w:t xml:space="preserve">Status (currently a fixed 4-value enum: TODO, IN_PROGRESS, IN_REVIEW, DONE — custom workflow system is planned, see below)</w:t>
       </w:r>
     </w:p>
     <w:p>
@@ -5377,7 +6412,7 @@
           <w:sz w:val="22"/>
           <w:szCs w:val="22"/>
         </w:rPr>
-        <w:t xml:space="preserve">Assignee (one or more team members)</w:t>
+        <w:t xml:space="preserve">Type (IssueType enum — e.g. Bug, Feature, Task)</w:t>
       </w:r>
     </w:p>
     <w:p>
@@ -5396,7 +6431,7 @@
           <w:sz w:val="22"/>
           <w:szCs w:val="22"/>
         </w:rPr>
-        <w:t xml:space="preserve">Reporter (the user who created the issue)</w:t>
+        <w:t xml:space="preserve">Assignee (single user FK — spec intent of multiple assignees not yet implemented)</w:t>
       </w:r>
     </w:p>
     <w:p>
@@ -5415,7 +6450,7 @@
           <w:sz w:val="22"/>
           <w:szCs w:val="22"/>
         </w:rPr>
-        <w:t xml:space="preserve">Labels (multi-select)</w:t>
+        <w:t xml:space="preserve">Reporter (the user who created the issue)</w:t>
       </w:r>
     </w:p>
     <w:p>
@@ -5434,7 +6469,7 @@
           <w:sz w:val="22"/>
           <w:szCs w:val="22"/>
         </w:rPr>
-        <w:t xml:space="preserve">Due Date</w:t>
+        <w:t xml:space="preserve">Labels (String[] array on Issue — no standalone Label model yet)</w:t>
       </w:r>
     </w:p>
     <w:p>
@@ -5453,7 +6488,7 @@
           <w:sz w:val="22"/>
           <w:szCs w:val="22"/>
         </w:rPr>
-        <w:t xml:space="preserve">Subtasks (nested issues)</w:t>
+        <w:t xml:space="preserve">Due Date</w:t>
       </w:r>
     </w:p>
     <w:p>
@@ -5472,7 +6507,7 @@
           <w:sz w:val="22"/>
           <w:szCs w:val="22"/>
         </w:rPr>
-        <w:t xml:space="preserve">Attachments (planned — files/screenshots)</w:t>
+        <w:t xml:space="preserve">Subtasks (nested issues via parentId FK)</w:t>
       </w:r>
     </w:p>
     <w:p>
@@ -5491,7 +6526,7 @@
           <w:sz w:val="22"/>
           <w:szCs w:val="22"/>
         </w:rPr>
-        <w:t xml:space="preserve">Comments</w:t>
+        <w:t xml:space="preserve">Attachments (built — files/screenshots via Railway S3)</w:t>
       </w:r>
     </w:p>
     <w:p>
@@ -5510,7 +6545,26 @@
           <w:sz w:val="22"/>
           <w:szCs w:val="22"/>
         </w:rPr>
-        <w:t xml:space="preserve">Activity log (system-generated events)</w:t>
+        <w:t xml:space="preserve">Comments (rich text via TipTap)</w:t>
+      </w:r>
+    </w:p>
+    <w:p>
+      <w:pPr>
+        <w:pStyle w:val="ListParagraph"/>
+        <w:numPr>
+          <w:ilvl w:val="0"/>
+          <w:numId w:val="2"/>
+        </w:numPr>
+        <w:spacing w:after="40" w:before="40"/>
+      </w:pPr>
+      <w:r>
+        <w:rPr>
+          <w:rFonts w:ascii="Arial" w:cs="Arial" w:eastAsia="Arial" w:hAnsi="Arial"/>
+          <w:color w:val="1F232B"/>
+          <w:sz w:val="22"/>
+          <w:szCs w:val="22"/>
+        </w:rPr>
+        <w:t xml:space="preserve">Activity log (system-generated events via ActivityLog model)</w:t>
       </w:r>
     </w:p>
     <w:p>
@@ -5549,7 +6603,25 @@
           <w:sz w:val="22"/>
           <w:szCs w:val="22"/>
         </w:rPr>
-        <w:t xml:space="preserve">JedForge uses a two-layer status system that separates display labels from system behavior.</w:t>
+        <w:t xml:space="preserve">The two-layer custom workflow system described below is the target design. It is fully specified and decisions are resolved. The current codebase uses a fixed 4-value IssueStatus enum (TODO, IN_PROGRESS, IN_REVIEW, DONE). Implementation of the custom workflow system is planned.</w:t>
+      </w:r>
+    </w:p>
+    <w:p>
+      <w:pPr>
+        <w:shd w:fill="FFFBEB" w:val="clear"/>
+        <w:spacing w:after="60" w:before="60"/>
+        <w:ind w:left="360"/>
+      </w:pPr>
+      <w:r>
+        <w:rPr>
+          <w:rFonts w:ascii="Arial" w:cs="Arial" w:eastAsia="Arial" w:hAnsi="Arial"/>
+          <w:i/>
+          <w:iCs/>
+          <w:color w:val="B45309"/>
+          <w:sz w:val="20"/>
+          <w:szCs w:val="20"/>
+        </w:rPr>
+        <w:t xml:space="preserve">⚠ Current implementation uses a fixed status enum. The Board and Column models exist in the schema but are not yet wired to the Kanban board renderer. This is a prerequisite for the custom workflow feature.</w:t>
       </w:r>
     </w:p>
     <w:p>
@@ -6242,7 +7314,7 @@
           <w:sz w:val="22"/>
           <w:szCs w:val="22"/>
         </w:rPr>
-        <w:t xml:space="preserve">Board state updates in real time for all users via SSE.</w:t>
+        <w:t xml:space="preserve">Board updates are currently polling-based (AutoRefresh at 3-minute intervals). SSE-based real-time updates are planned.</w:t>
       </w:r>
     </w:p>
     <w:p>
@@ -6261,7 +7333,7 @@
           <w:sz w:val="22"/>
           <w:szCs w:val="22"/>
         </w:rPr>
-        <w:t xml:space="preserve">Column order on the board follows the Admin-defined status display order.</w:t>
+        <w:t xml:space="preserve">Column order on the board will follow Admin-defined status display order once custom workflows are implemented.</w:t>
       </w:r>
     </w:p>
     <w:p>
@@ -6336,7 +7408,7 @@
           <w:sz w:val="22"/>
           <w:szCs w:val="22"/>
         </w:rPr>
-        <w:t xml:space="preserve">JedForge uses context-dependent navigation — the navigation structure adapts based on the section of the application the user is in rather than a single static layout.</w:t>
+        <w:t xml:space="preserve">JedForge uses context-dependent navigation — the structure adapts based on where the user is in the application.</w:t>
       </w:r>
     </w:p>
     <w:p>
@@ -6360,7 +7432,7 @@
           <w:sz w:val="22"/>
           <w:szCs w:val="22"/>
         </w:rPr>
-        <w:t xml:space="preserve">A persistent top navigation bar is present across all views, containing the JedForge logo/wordmark, global search, notifications, and user profile access.</w:t>
+        <w:t xml:space="preserve">A persistent sidebar is present across all authenticated views. At the workspace level it shows Dashboard, Search, Projects, and Admin (for Admins). The JedForge logo and user menu are in the sidebar.</w:t>
       </w:r>
     </w:p>
     <w:p>
@@ -6379,7 +7451,7 @@
           <w:sz w:val="22"/>
           <w:szCs w:val="22"/>
         </w:rPr>
-        <w:t xml:space="preserve">A contextual sidebar appears when inside a project, providing access to that project's board, list view, backlog, milestones, sprints, settings, and members.</w:t>
+        <w:t xml:space="preserve">A header bar runs across the top of each view containing breadcrumbs, a theme toggle, and a Create Issue button. It does not currently contain global search or notifications — these are planned additions.</w:t>
       </w:r>
     </w:p>
     <w:p>
@@ -6398,29 +7470,7 @@
           <w:sz w:val="22"/>
           <w:szCs w:val="22"/>
         </w:rPr>
-        <w:t xml:space="preserve">At the workspace/home level, navigation shifts to show all projects, workspace settings, and admin tools (for Admins).</w:t>
-      </w:r>
-    </w:p>
-    <w:p>
-      <w:pPr>
-        <w:spacing w:after="0" w:before="120"/>
-      </w:pPr>
-    </w:p>
-    <w:p>
-      <w:pPr>
-        <w:pStyle w:val="Heading2"/>
-        <w:spacing w:after="80" w:before="200"/>
-      </w:pPr>
-      <w:r>
-        <w:rPr>
-          <w:rFonts w:ascii="Arial" w:cs="Arial" w:eastAsia="Arial" w:hAnsi="Arial"/>
-          <w:b/>
-          <w:bCs/>
-          <w:color w:val="1F232B"/>
-          <w:sz w:val="24"/>
-          <w:szCs w:val="24"/>
-        </w:rPr>
-        <w:t xml:space="preserve">Branding</w:t>
+        <w:t xml:space="preserve">Within a project, a ProjectNav tab bar provides access to Board, Issues, Activity, and Settings.</w:t>
       </w:r>
     </w:p>
     <w:p>
@@ -6439,7 +7489,7 @@
           <w:sz w:val="22"/>
           <w:szCs w:val="22"/>
         </w:rPr>
-        <w:t xml:space="preserve">Brand colors: #FF6A00 (orange), #1F232B (near-black), #FFFFFF (white).</w:t>
+        <w:t xml:space="preserve">Planned additions to the header: global search input, notifications bell with unread count badge.</w:t>
       </w:r>
     </w:p>
     <w:p>
@@ -6458,7 +7508,29 @@
           <w:sz w:val="22"/>
           <w:szCs w:val="22"/>
         </w:rPr>
-        <w:t xml:space="preserve">Logo: DarkModeLogo.png and LightModeLogo.png — swapped automatically based on active theme.</w:t>
+        <w:t xml:space="preserve">Planned additions to the project sidebar: Backlog, Milestones, Sprints, and Members links (dependent on those features being built).</w:t>
+      </w:r>
+    </w:p>
+    <w:p>
+      <w:pPr>
+        <w:spacing w:after="0" w:before="120"/>
+      </w:pPr>
+    </w:p>
+    <w:p>
+      <w:pPr>
+        <w:pStyle w:val="Heading2"/>
+        <w:spacing w:after="80" w:before="200"/>
+      </w:pPr>
+      <w:r>
+        <w:rPr>
+          <w:rFonts w:ascii="Arial" w:cs="Arial" w:eastAsia="Arial" w:hAnsi="Arial"/>
+          <w:b/>
+          <w:bCs/>
+          <w:color w:val="1F232B"/>
+          <w:sz w:val="24"/>
+          <w:szCs w:val="24"/>
+        </w:rPr>
+        <w:t xml:space="preserve">Branding</w:t>
       </w:r>
     </w:p>
     <w:p>
@@ -6477,7 +7549,7 @@
           <w:sz w:val="22"/>
           <w:szCs w:val="22"/>
         </w:rPr>
-        <w:t xml:space="preserve">Icon: JF monogram available at multiple sizes (16px to 1024px) in light and dark variants.</w:t>
+        <w:t xml:space="preserve">Brand colors: #FF6A00 (orange), #1F232B (near-black), #FFFFFF (white). Theme color in web manifest is #FF6A00.</w:t>
       </w:r>
     </w:p>
     <w:p>
@@ -6496,29 +7568,7 @@
           <w:sz w:val="22"/>
           <w:szCs w:val="22"/>
         </w:rPr>
-        <w:t xml:space="preserve">Favicon and web manifest are wired to the icon package.</w:t>
-      </w:r>
-    </w:p>
-    <w:p>
-      <w:pPr>
-        <w:spacing w:after="0" w:before="120"/>
-      </w:pPr>
-    </w:p>
-    <w:p>
-      <w:pPr>
-        <w:pStyle w:val="Heading2"/>
-        <w:spacing w:after="80" w:before="200"/>
-      </w:pPr>
-      <w:r>
-        <w:rPr>
-          <w:rFonts w:ascii="Arial" w:cs="Arial" w:eastAsia="Arial" w:hAnsi="Arial"/>
-          <w:b/>
-          <w:bCs/>
-          <w:color w:val="1F232B"/>
-          <w:sz w:val="24"/>
-          <w:szCs w:val="24"/>
-        </w:rPr>
-        <w:t xml:space="preserve">Theming</w:t>
+        <w:t xml:space="preserve">Logo: logo-light.png and logo-dark.png in /public/. Sidebar swaps logos using block dark:hidden / hidden dark:block Tailwind classes.</w:t>
       </w:r>
     </w:p>
     <w:p>
@@ -6537,7 +7587,7 @@
           <w:sz w:val="22"/>
           <w:szCs w:val="22"/>
         </w:rPr>
-        <w:t xml:space="preserve">Light, dark, and system themes are supported via next-themes.</w:t>
+        <w:t xml:space="preserve">Icon: JF monogram in /public/icons/light/ and /public/icons/dark/ at multiple sizes (16px to 1024px).</w:t>
       </w:r>
     </w:p>
     <w:p>
@@ -6556,7 +7606,7 @@
           <w:sz w:val="22"/>
           <w:szCs w:val="22"/>
         </w:rPr>
-        <w:t xml:space="preserve">Theme toggle is accessible from the top navigation bar.</w:t>
+        <w:t xml:space="preserve">Favicon: wired in layout.tsx metadata to /icons/light/favicon-32.png and /icons/light/favicon-16.png.</w:t>
       </w:r>
     </w:p>
     <w:p>
@@ -6575,87 +7625,29 @@
           <w:sz w:val="22"/>
           <w:szCs w:val="22"/>
         </w:rPr>
-        <w:t xml:space="preserve">Tailwind dark: variants use class-based toggling (not prefers-color-scheme media queries).</w:t>
-      </w:r>
-    </w:p>
-    <w:p>
-      <w:pPr>
-        <w:spacing w:after="0" w:before="200"/>
-      </w:pPr>
-    </w:p>
-    <w:p>
-      <w:pPr>
-        <w:pStyle w:val="Heading1"/>
-        <w:spacing w:after="120" w:before="0"/>
+        <w:t xml:space="preserve">Web manifest: /public/site.webmanifest references /icons/light/icon-512.png and /icons/light/icon-256.png.</w:t>
+      </w:r>
+    </w:p>
+    <w:p>
+      <w:pPr>
+        <w:spacing w:after="0" w:before="120"/>
+      </w:pPr>
+    </w:p>
+    <w:p>
+      <w:pPr>
+        <w:pStyle w:val="Heading2"/>
+        <w:spacing w:after="80" w:before="200"/>
       </w:pPr>
       <w:r>
         <w:rPr>
           <w:rFonts w:ascii="Arial" w:cs="Arial" w:eastAsia="Arial" w:hAnsi="Arial"/>
           <w:b/>
           <w:bCs/>
-          <w:color w:val="FF6A00"/>
-          <w:sz w:val="28"/>
-          <w:szCs w:val="28"/>
-        </w:rPr>
-        <w:t xml:space="preserve">7.  </w:t>
-      </w:r>
-      <w:r>
-        <w:rPr>
-          <w:rFonts w:ascii="Arial" w:cs="Arial" w:eastAsia="Arial" w:hAnsi="Arial"/>
-          <w:b/>
-          <w:bCs/>
-          <w:color w:val="1F232B"/>
-          <w:sz w:val="28"/>
-          <w:szCs w:val="28"/>
-        </w:rPr>
-        <w:t xml:space="preserve">Real-Time Collaboration</w:t>
-      </w:r>
-    </w:p>
-    <w:p>
-      <w:pPr>
-        <w:pBdr>
-          <w:bottom w:val="single" w:color="E2E8F0" w:sz="6" w:space="1"/>
-        </w:pBdr>
-        <w:spacing w:after="160" w:before="160"/>
-      </w:pPr>
-    </w:p>
-    <w:p>
-      <w:pPr>
-        <w:spacing w:after="60" w:before="60"/>
-        <w:jc w:val="left"/>
-      </w:pPr>
-      <w:r>
-        <w:rPr>
-          <w:rFonts w:ascii="Arial" w:cs="Arial" w:eastAsia="Arial" w:hAnsi="Arial"/>
-          <w:b w:val="false"/>
-          <w:bCs w:val="false"/>
-          <w:color w:val="1F232B"/>
-          <w:sz w:val="22"/>
-          <w:szCs w:val="22"/>
-        </w:rPr>
-        <w:t xml:space="preserve">JedForge is a fully real-time collaborative application. All connected users see changes reflected instantly without requiring a page refresh.</w:t>
-      </w:r>
-    </w:p>
-    <w:p>
-      <w:pPr>
-        <w:spacing w:after="0" w:before="80"/>
-      </w:pPr>
-    </w:p>
-    <w:p>
-      <w:pPr>
-        <w:pStyle w:val="Heading2"/>
-        <w:spacing w:after="80" w:before="200"/>
-      </w:pPr>
-      <w:r>
-        <w:rPr>
-          <w:rFonts w:ascii="Arial" w:cs="Arial" w:eastAsia="Arial" w:hAnsi="Arial"/>
-          <w:b/>
-          <w:bCs/>
           <w:color w:val="1F232B"/>
           <w:sz w:val="24"/>
           <w:szCs w:val="24"/>
         </w:rPr>
-        <w:t xml:space="preserve">Real-Time Events (SSE)</w:t>
+        <w:t xml:space="preserve">Theming</w:t>
       </w:r>
     </w:p>
     <w:p>
@@ -6674,7 +7666,7 @@
           <w:sz w:val="22"/>
           <w:szCs w:val="22"/>
         </w:rPr>
-        <w:t xml:space="preserve">Issue status changes</w:t>
+        <w:t xml:space="preserve">Light, dark, and system themes are supported via next-themes.</w:t>
       </w:r>
     </w:p>
     <w:p>
@@ -6693,7 +7685,7 @@
           <w:sz w:val="22"/>
           <w:szCs w:val="22"/>
         </w:rPr>
-        <w:t xml:space="preserve">New comments posted</w:t>
+        <w:t xml:space="preserve">Theme toggle is accessible from the top navigation bar.</w:t>
       </w:r>
     </w:p>
     <w:p>
@@ -6712,7 +7704,87 @@
           <w:sz w:val="22"/>
           <w:szCs w:val="22"/>
         </w:rPr>
-        <w:t xml:space="preserve">Issue assignments and reassignments</w:t>
+        <w:t xml:space="preserve">Tailwind dark: variants use class-based toggling (not prefers-color-scheme media queries).</w:t>
+      </w:r>
+    </w:p>
+    <w:p>
+      <w:pPr>
+        <w:spacing w:after="0" w:before="200"/>
+      </w:pPr>
+    </w:p>
+    <w:p>
+      <w:pPr>
+        <w:pStyle w:val="Heading1"/>
+        <w:spacing w:after="120" w:before="0"/>
+      </w:pPr>
+      <w:r>
+        <w:rPr>
+          <w:rFonts w:ascii="Arial" w:cs="Arial" w:eastAsia="Arial" w:hAnsi="Arial"/>
+          <w:b/>
+          <w:bCs/>
+          <w:color w:val="FF6A00"/>
+          <w:sz w:val="28"/>
+          <w:szCs w:val="28"/>
+        </w:rPr>
+        <w:t xml:space="preserve">7.  </w:t>
+      </w:r>
+      <w:r>
+        <w:rPr>
+          <w:rFonts w:ascii="Arial" w:cs="Arial" w:eastAsia="Arial" w:hAnsi="Arial"/>
+          <w:b/>
+          <w:bCs/>
+          <w:color w:val="1F232B"/>
+          <w:sz w:val="28"/>
+          <w:szCs w:val="28"/>
+        </w:rPr>
+        <w:t xml:space="preserve">Real-Time Collaboration</w:t>
+      </w:r>
+    </w:p>
+    <w:p>
+      <w:pPr>
+        <w:pBdr>
+          <w:bottom w:val="single" w:color="E2E8F0" w:sz="6" w:space="1"/>
+        </w:pBdr>
+        <w:spacing w:after="160" w:before="160"/>
+      </w:pPr>
+    </w:p>
+    <w:p>
+      <w:pPr>
+        <w:spacing w:after="60" w:before="60"/>
+        <w:jc w:val="left"/>
+      </w:pPr>
+      <w:r>
+        <w:rPr>
+          <w:rFonts w:ascii="Arial" w:cs="Arial" w:eastAsia="Arial" w:hAnsi="Arial"/>
+          <w:b w:val="false"/>
+          <w:bCs w:val="false"/>
+          <w:color w:val="1F232B"/>
+          <w:sz w:val="22"/>
+          <w:szCs w:val="22"/>
+        </w:rPr>
+        <w:t xml:space="preserve">Full real-time collaboration via Server-Sent Events (SSE) is the target architecture for JedForge. It is not yet implemented. The current approach is polling-based.</w:t>
+      </w:r>
+    </w:p>
+    <w:p>
+      <w:pPr>
+        <w:spacing w:after="0" w:before="80"/>
+      </w:pPr>
+    </w:p>
+    <w:p>
+      <w:pPr>
+        <w:pStyle w:val="Heading2"/>
+        <w:spacing w:after="80" w:before="200"/>
+      </w:pPr>
+      <w:r>
+        <w:rPr>
+          <w:rFonts w:ascii="Arial" w:cs="Arial" w:eastAsia="Arial" w:hAnsi="Arial"/>
+          <w:b/>
+          <w:bCs/>
+          <w:color w:val="1F232B"/>
+          <w:sz w:val="24"/>
+          <w:szCs w:val="24"/>
+        </w:rPr>
+        <w:t xml:space="preserve">Current Implementation — Polling</w:t>
       </w:r>
     </w:p>
     <w:p>
@@ -6731,7 +7803,7 @@
           <w:sz w:val="22"/>
           <w:szCs w:val="22"/>
         </w:rPr>
-        <w:t xml:space="preserve">Subtask creation and completion</w:t>
+        <w:t xml:space="preserve">AutoRefresh component calls router.refresh() on a 3-minute interval.</w:t>
       </w:r>
     </w:p>
     <w:p>
@@ -6750,7 +7822,7 @@
           <w:sz w:val="22"/>
           <w:szCs w:val="22"/>
         </w:rPr>
-        <w:t xml:space="preserve">Activity feed updates</w:t>
+        <w:t xml:space="preserve">Mounted on the board page and issues list page.</w:t>
       </w:r>
     </w:p>
     <w:p>
@@ -6769,6 +7841,178 @@
           <w:sz w:val="22"/>
           <w:szCs w:val="22"/>
         </w:rPr>
+        <w:t xml:space="preserve">Changes made by other users are visible after the next poll cycle or on navigation.</w:t>
+      </w:r>
+    </w:p>
+    <w:p>
+      <w:pPr>
+        <w:pStyle w:val="ListParagraph"/>
+        <w:numPr>
+          <w:ilvl w:val="0"/>
+          <w:numId w:val="2"/>
+        </w:numPr>
+        <w:spacing w:after="40" w:before="40"/>
+      </w:pPr>
+      <w:r>
+        <w:rPr>
+          <w:rFonts w:ascii="Arial" w:cs="Arial" w:eastAsia="Arial" w:hAnsi="Arial"/>
+          <w:color w:val="1F232B"/>
+          <w:sz w:val="22"/>
+          <w:szCs w:val="22"/>
+        </w:rPr>
+        <w:t xml:space="preserve">This is a known gap from the target spec and will be replaced by SSE.</w:t>
+      </w:r>
+    </w:p>
+    <w:p>
+      <w:pPr>
+        <w:spacing w:after="0" w:before="80"/>
+      </w:pPr>
+    </w:p>
+    <w:p>
+      <w:pPr>
+        <w:pStyle w:val="Heading2"/>
+        <w:spacing w:after="80" w:before="200"/>
+      </w:pPr>
+      <w:r>
+        <w:rPr>
+          <w:rFonts w:ascii="Arial" w:cs="Arial" w:eastAsia="Arial" w:hAnsi="Arial"/>
+          <w:b/>
+          <w:bCs/>
+          <w:color w:val="1F232B"/>
+          <w:sz w:val="24"/>
+          <w:szCs w:val="24"/>
+        </w:rPr>
+        <w:t xml:space="preserve">Target Implementation — SSE (Planned)</w:t>
+      </w:r>
+    </w:p>
+    <w:p>
+      <w:pPr>
+        <w:spacing w:after="60" w:before="60"/>
+        <w:jc w:val="left"/>
+      </w:pPr>
+      <w:r>
+        <w:rPr>
+          <w:rFonts w:ascii="Arial" w:cs="Arial" w:eastAsia="Arial" w:hAnsi="Arial"/>
+          <w:b w:val="false"/>
+          <w:bCs w:val="false"/>
+          <w:color w:val="1F232B"/>
+          <w:sz w:val="22"/>
+          <w:szCs w:val="22"/>
+        </w:rPr>
+        <w:t xml:space="preserve">When SSE is implemented, the following events will be pushed to all connected clients in real time without polling:</w:t>
+      </w:r>
+    </w:p>
+    <w:p>
+      <w:pPr>
+        <w:pStyle w:val="ListParagraph"/>
+        <w:numPr>
+          <w:ilvl w:val="0"/>
+          <w:numId w:val="2"/>
+        </w:numPr>
+        <w:spacing w:after="40" w:before="40"/>
+      </w:pPr>
+      <w:r>
+        <w:rPr>
+          <w:rFonts w:ascii="Arial" w:cs="Arial" w:eastAsia="Arial" w:hAnsi="Arial"/>
+          <w:color w:val="1F232B"/>
+          <w:sz w:val="22"/>
+          <w:szCs w:val="22"/>
+        </w:rPr>
+        <w:t xml:space="preserve">Issue status changes</w:t>
+      </w:r>
+    </w:p>
+    <w:p>
+      <w:pPr>
+        <w:pStyle w:val="ListParagraph"/>
+        <w:numPr>
+          <w:ilvl w:val="0"/>
+          <w:numId w:val="2"/>
+        </w:numPr>
+        <w:spacing w:after="40" w:before="40"/>
+      </w:pPr>
+      <w:r>
+        <w:rPr>
+          <w:rFonts w:ascii="Arial" w:cs="Arial" w:eastAsia="Arial" w:hAnsi="Arial"/>
+          <w:color w:val="1F232B"/>
+          <w:sz w:val="22"/>
+          <w:szCs w:val="22"/>
+        </w:rPr>
+        <w:t xml:space="preserve">New comments posted</w:t>
+      </w:r>
+    </w:p>
+    <w:p>
+      <w:pPr>
+        <w:pStyle w:val="ListParagraph"/>
+        <w:numPr>
+          <w:ilvl w:val="0"/>
+          <w:numId w:val="2"/>
+        </w:numPr>
+        <w:spacing w:after="40" w:before="40"/>
+      </w:pPr>
+      <w:r>
+        <w:rPr>
+          <w:rFonts w:ascii="Arial" w:cs="Arial" w:eastAsia="Arial" w:hAnsi="Arial"/>
+          <w:color w:val="1F232B"/>
+          <w:sz w:val="22"/>
+          <w:szCs w:val="22"/>
+        </w:rPr>
+        <w:t xml:space="preserve">Issue assignments and reassignments</w:t>
+      </w:r>
+    </w:p>
+    <w:p>
+      <w:pPr>
+        <w:pStyle w:val="ListParagraph"/>
+        <w:numPr>
+          <w:ilvl w:val="0"/>
+          <w:numId w:val="2"/>
+        </w:numPr>
+        <w:spacing w:after="40" w:before="40"/>
+      </w:pPr>
+      <w:r>
+        <w:rPr>
+          <w:rFonts w:ascii="Arial" w:cs="Arial" w:eastAsia="Arial" w:hAnsi="Arial"/>
+          <w:color w:val="1F232B"/>
+          <w:sz w:val="22"/>
+          <w:szCs w:val="22"/>
+        </w:rPr>
+        <w:t xml:space="preserve">Subtask creation and completion</w:t>
+      </w:r>
+    </w:p>
+    <w:p>
+      <w:pPr>
+        <w:pStyle w:val="ListParagraph"/>
+        <w:numPr>
+          <w:ilvl w:val="0"/>
+          <w:numId w:val="2"/>
+        </w:numPr>
+        <w:spacing w:after="40" w:before="40"/>
+      </w:pPr>
+      <w:r>
+        <w:rPr>
+          <w:rFonts w:ascii="Arial" w:cs="Arial" w:eastAsia="Arial" w:hAnsi="Arial"/>
+          <w:color w:val="1F232B"/>
+          <w:sz w:val="22"/>
+          <w:szCs w:val="22"/>
+        </w:rPr>
+        <w:t xml:space="preserve">Activity feed updates</w:t>
+      </w:r>
+    </w:p>
+    <w:p>
+      <w:pPr>
+        <w:pStyle w:val="ListParagraph"/>
+        <w:numPr>
+          <w:ilvl w:val="0"/>
+          <w:numId w:val="2"/>
+        </w:numPr>
+        <w:spacing w:after="40" w:before="40"/>
+      </w:pPr>
+      <w:r>
+        <w:rPr>
+          <w:rFonts w:ascii="Arial" w:cs="Arial" w:eastAsia="Arial" w:hAnsi="Arial"/>
+          <w:color w:val="1F232B"/>
+          <w:sz w:val="22"/>
+          <w:szCs w:val="22"/>
+        </w:rPr>
         <w:t xml:space="preserve">In-app notification delivery</w:t>
       </w:r>
     </w:p>
@@ -6791,7 +8035,7 @@
           <w:sz w:val="22"/>
           <w:szCs w:val="22"/>
         </w:rPr>
-        <w:t xml:space="preserve">Real-time functionality is implemented using Server-Sent Events (SSE). This is a unidirectional server-to-client push mechanism suitable for the current event types. If bidirectional real-time communication is needed in the future (e.g. collaborative editing), a WebSocket implementation should be evaluated.</w:t>
+        <w:t xml:space="preserve">SSE is a unidirectional server-to-client push mechanism suitable for these event types. If bidirectional real-time communication is needed in the future (e.g. collaborative editing), a WebSocket implementation should be evaluated.</w:t>
       </w:r>
     </w:p>
     <w:p>
@@ -7035,11 +8279,11 @@
                 <w:bCs w:val="false"/>
                 <w:i w:val="false"/>
                 <w:iCs w:val="false"/>
-                <w:color w:val="166534"/>
-                <w:sz w:val="20"/>
-                <w:szCs w:val="20"/>
-              </w:rPr>
-              <w:t xml:space="preserve">Built</w:t>
+                <w:color w:val="92400E"/>
+                <w:sz w:val="20"/>
+                <w:szCs w:val="20"/>
+              </w:rPr>
+              <w:t xml:space="preserve">Planned</w:t>
             </w:r>
           </w:p>
         </w:tc>
@@ -7076,7 +8320,7 @@
                 <w:sz w:val="20"/>
                 <w:szCs w:val="20"/>
               </w:rPr>
-              <w:t xml:space="preserve">Users can sign in with their GitHub account. Handled via NextAuth.js GitHub provider.</w:t>
+              <w:t xml:space="preserve">Not yet implemented. Only Credentials provider is active. GitHub provider needs to be added to auth.ts with GITHUB_ID and GITHUB_SECRET environment variables. Previously marked as Built — this was incorrect.</w:t>
             </w:r>
           </w:p>
         </w:tc>
@@ -7189,7 +8433,7 @@
                 <w:sz w:val="20"/>
                 <w:szCs w:val="20"/>
               </w:rPr>
-              <w:t xml:space="preserve">System-generated emails for assignments, mentions, due date reminders, and digest summaries. Email provider TBD.</w:t>
+              <w:t xml:space="preserve">System-generated emails for assignments, mentions, due date reminders, and digest summaries. Email provider TBD (see Open Decision #3).</w:t>
             </w:r>
           </w:p>
         </w:tc>
@@ -7441,7 +8685,7 @@
           <w:sz w:val="20"/>
           <w:szCs w:val="20"/>
         </w:rPr>
-        <w:t xml:space="preserve">⚠ No competitor product names (e.g. 'JQL') should appear in the JedForge UI. All query and filter language should use generic descriptive terminology.</w:t>
+        <w:t xml:space="preserve">⚠ No competitor product names (e.g. 'JQL') should appear in the JedForge UI. All query and filter language should use generic descriptive terminology. The current query language implementation correctly avoids this naming.</w:t>
       </w:r>
     </w:p>
     <w:p>
@@ -7803,7 +9047,7 @@
                 <w:sz w:val="20"/>
                 <w:szCs w:val="20"/>
               </w:rPr>
-              <w:t xml:space="preserve">A full mobile app (React Native or PWA) is a long-term goal. Not currently scoped.</w:t>
+              <w:t xml:space="preserve">A full mobile app (React Native or PWA) is a long-term goal. Not currently scoped (see Open Decision #5).</w:t>
             </w:r>
           </w:p>
         </w:tc>
@@ -7994,7 +9238,7 @@
                 <w:sz w:val="20"/>
                 <w:szCs w:val="20"/>
               </w:rPr>
-              <w:t xml:space="preserve">Accessibility</w:t>
+              <w:t xml:space="preserve">Testing</w:t>
             </w:r>
           </w:p>
         </w:tc>
@@ -8031,7 +9275,7 @@
                 <w:sz w:val="20"/>
                 <w:szCs w:val="20"/>
               </w:rPr>
-              <w:t xml:space="preserve">Not a current priority. To be revisited before any public launch.</w:t>
+              <w:t xml:space="preserve">Vitest unit tests exist for Kanban logic, permissions, query parser/executor, tenancy, and saved filters. Playwright is installed for E2E but no test files exist yet.</w:t>
             </w:r>
           </w:p>
         </w:tc>
@@ -8070,7 +9314,7 @@
                 <w:sz w:val="20"/>
                 <w:szCs w:val="20"/>
               </w:rPr>
-              <w:t xml:space="preserve">Internationalization</w:t>
+              <w:t xml:space="preserve">Billing Infrastructure</w:t>
             </w:r>
           </w:p>
         </w:tc>
@@ -8107,7 +9351,7 @@
                 <w:sz w:val="20"/>
                 <w:szCs w:val="20"/>
               </w:rPr>
-              <w:t xml:space="preserve">Not planned. English only.</w:t>
+              <w:t xml:space="preserve">Stripe schema (Subscription model with stripeCustomerId, stripeSubscriptionId, Plan enum) is present in the codebase. Billing logic is not yet active. Monetization model is an open decision (see Section 12).</w:t>
             </w:r>
           </w:p>
         </w:tc>
@@ -8146,7 +9390,7 @@
                 <w:sz w:val="20"/>
                 <w:szCs w:val="20"/>
               </w:rPr>
-              <w:t xml:space="preserve">Monetization</w:t>
+              <w:t xml:space="preserve">Accessibility</w:t>
             </w:r>
           </w:p>
         </w:tc>
@@ -8183,7 +9427,159 @@
                 <w:sz w:val="20"/>
                 <w:szCs w:val="20"/>
               </w:rPr>
-              <w:t xml:space="preserve">Not yet decided. Architecture should not preclude future freemium or SaaS billing models.</w:t>
+              <w:t xml:space="preserve">Not a current priority. To be revisited before any public launch.</w:t>
+            </w:r>
+          </w:p>
+        </w:tc>
+      </w:tr>
+      <w:tr>
+        <w:tc>
+          <w:tcPr>
+            <w:tcW w:type="dxa" w:w="2600"/>
+            <w:tcBorders>
+              <w:top w:val="single" w:color="E2E8F0" w:sz="1"/>
+              <w:left w:val="single" w:color="E2E8F0" w:sz="1"/>
+              <w:bottom w:val="single" w:color="E2E8F0" w:sz="1"/>
+              <w:right w:val="single" w:color="E2E8F0" w:sz="1"/>
+            </w:tcBorders>
+            <w:shd w:fill="FFFFFF" w:val="clear"/>
+            <w:tcMar>
+              <w:top w:type="dxa" w:w="100"/>
+              <w:left w:type="dxa" w:w="140"/>
+              <w:bottom w:type="dxa" w:w="100"/>
+              <w:right w:type="dxa" w:w="140"/>
+            </w:tcMar>
+            <w:vAlign w:val="top"/>
+          </w:tcPr>
+          <w:p>
+            <w:pPr>
+              <w:spacing w:after="0" w:before="0"/>
+            </w:pPr>
+            <w:r>
+              <w:rPr>
+                <w:rFonts w:ascii="Arial" w:cs="Arial" w:eastAsia="Arial" w:hAnsi="Arial"/>
+                <w:b/>
+                <w:bCs/>
+                <w:i w:val="false"/>
+                <w:iCs w:val="false"/>
+                <w:color w:val="1F232B"/>
+                <w:sz w:val="20"/>
+                <w:szCs w:val="20"/>
+              </w:rPr>
+              <w:t xml:space="preserve">Internationalization</w:t>
+            </w:r>
+          </w:p>
+        </w:tc>
+        <w:tc>
+          <w:tcPr>
+            <w:tcW w:type="dxa" w:w="6760"/>
+            <w:tcBorders>
+              <w:top w:val="single" w:color="E2E8F0" w:sz="1"/>
+              <w:left w:val="single" w:color="E2E8F0" w:sz="1"/>
+              <w:bottom w:val="single" w:color="E2E8F0" w:sz="1"/>
+              <w:right w:val="single" w:color="E2E8F0" w:sz="1"/>
+            </w:tcBorders>
+            <w:shd w:fill="FFFFFF" w:val="clear"/>
+            <w:tcMar>
+              <w:top w:type="dxa" w:w="100"/>
+              <w:left w:type="dxa" w:w="140"/>
+              <w:bottom w:type="dxa" w:w="100"/>
+              <w:right w:type="dxa" w:w="140"/>
+            </w:tcMar>
+            <w:vAlign w:val="top"/>
+          </w:tcPr>
+          <w:p>
+            <w:pPr>
+              <w:spacing w:after="0" w:before="0"/>
+            </w:pPr>
+            <w:r>
+              <w:rPr>
+                <w:rFonts w:ascii="Arial" w:cs="Arial" w:eastAsia="Arial" w:hAnsi="Arial"/>
+                <w:b w:val="false"/>
+                <w:bCs w:val="false"/>
+                <w:i w:val="false"/>
+                <w:iCs w:val="false"/>
+                <w:color w:val="1F232B"/>
+                <w:sz w:val="20"/>
+                <w:szCs w:val="20"/>
+              </w:rPr>
+              <w:t xml:space="preserve">Not planned. English only.</w:t>
+            </w:r>
+          </w:p>
+        </w:tc>
+      </w:tr>
+      <w:tr>
+        <w:tc>
+          <w:tcPr>
+            <w:tcW w:type="dxa" w:w="2600"/>
+            <w:tcBorders>
+              <w:top w:val="single" w:color="E2E8F0" w:sz="1"/>
+              <w:left w:val="single" w:color="E2E8F0" w:sz="1"/>
+              <w:bottom w:val="single" w:color="E2E8F0" w:sz="1"/>
+              <w:right w:val="single" w:color="E2E8F0" w:sz="1"/>
+            </w:tcBorders>
+            <w:shd w:fill="F8F9FA" w:val="clear"/>
+            <w:tcMar>
+              <w:top w:type="dxa" w:w="100"/>
+              <w:left w:type="dxa" w:w="140"/>
+              <w:bottom w:type="dxa" w:w="100"/>
+              <w:right w:type="dxa" w:w="140"/>
+            </w:tcMar>
+            <w:vAlign w:val="top"/>
+          </w:tcPr>
+          <w:p>
+            <w:pPr>
+              <w:spacing w:after="0" w:before="0"/>
+            </w:pPr>
+            <w:r>
+              <w:rPr>
+                <w:rFonts w:ascii="Arial" w:cs="Arial" w:eastAsia="Arial" w:hAnsi="Arial"/>
+                <w:b/>
+                <w:bCs/>
+                <w:i w:val="false"/>
+                <w:iCs w:val="false"/>
+                <w:color w:val="1F232B"/>
+                <w:sz w:val="20"/>
+                <w:szCs w:val="20"/>
+              </w:rPr>
+              <w:t xml:space="preserve">Monetization</w:t>
+            </w:r>
+          </w:p>
+        </w:tc>
+        <w:tc>
+          <w:tcPr>
+            <w:tcW w:type="dxa" w:w="6760"/>
+            <w:tcBorders>
+              <w:top w:val="single" w:color="E2E8F0" w:sz="1"/>
+              <w:left w:val="single" w:color="E2E8F0" w:sz="1"/>
+              <w:bottom w:val="single" w:color="E2E8F0" w:sz="1"/>
+              <w:right w:val="single" w:color="E2E8F0" w:sz="1"/>
+            </w:tcBorders>
+            <w:shd w:fill="F8F9FA" w:val="clear"/>
+            <w:tcMar>
+              <w:top w:type="dxa" w:w="100"/>
+              <w:left w:type="dxa" w:w="140"/>
+              <w:bottom w:type="dxa" w:w="100"/>
+              <w:right w:type="dxa" w:w="140"/>
+            </w:tcMar>
+            <w:vAlign w:val="top"/>
+          </w:tcPr>
+          <w:p>
+            <w:pPr>
+              <w:spacing w:after="0" w:before="0"/>
+            </w:pPr>
+            <w:r>
+              <w:rPr>
+                <w:rFonts w:ascii="Arial" w:cs="Arial" w:eastAsia="Arial" w:hAnsi="Arial"/>
+                <w:b w:val="false"/>
+                <w:bCs w:val="false"/>
+                <w:i w:val="false"/>
+                <w:iCs w:val="false"/>
+                <w:color w:val="1F232B"/>
+                <w:sz w:val="20"/>
+                <w:szCs w:val="20"/>
+              </w:rPr>
+              <w:t xml:space="preserve">Not yet decided. Stripe infrastructure is roughed in. See Open Decision #4.</w:t>
             </w:r>
           </w:p>
         </w:tc>
@@ -8494,7 +9890,7 @@
                 <w:sz w:val="20"/>
                 <w:szCs w:val="20"/>
               </w:rPr>
-              <w:t xml:space="preserve">id, name, email, password (hashed), image, globalRole (Admin | TeamMember | Viewer), createdAt. Belongs to one Workspace.</w:t>
+              <w:t xml:space="preserve">id, name, email, passwordHash, avatarUrl, role (UserRole: ADMIN | TEAM_MEMBER | VIEWER), createdAt, updatedAt. Belongs to one Organization.</w:t>
             </w:r>
           </w:p>
         </w:tc>
@@ -8533,7 +9929,7 @@
                 <w:sz w:val="20"/>
                 <w:szCs w:val="20"/>
               </w:rPr>
-              <w:t xml:space="preserve">Workspace</w:t>
+              <w:t xml:space="preserve">Organization</w:t>
             </w:r>
           </w:p>
         </w:tc>
@@ -8570,7 +9966,7 @@
                 <w:sz w:val="20"/>
                 <w:szCs w:val="20"/>
               </w:rPr>
-              <w:t xml:space="preserve">id, name, slug. Contains Projects. Users are members of a Workspace.</w:t>
+              <w:t xml:space="preserve">id, name, slug, plan (Plan: FREE | PRO | TEAM), ownerId, createdAt, updatedAt. Serves the role of 'Workspace' in the spec. Contains Projects and OrgMembers.</w:t>
             </w:r>
           </w:p>
         </w:tc>
@@ -8609,7 +10005,7 @@
                 <w:sz w:val="20"/>
                 <w:szCs w:val="20"/>
               </w:rPr>
-              <w:t xml:space="preserve">Project</w:t>
+              <w:t xml:space="preserve">OrgMember</w:t>
             </w:r>
           </w:p>
         </w:tc>
@@ -8646,7 +10042,7 @@
                 <w:sz w:val="20"/>
                 <w:szCs w:val="20"/>
               </w:rPr>
-              <w:t xml:space="preserve">id, name, description, status (active/archived), isPrivate (boolean), workspaceId. Contains Issues, Members, Milestones, Sprints.</w:t>
+              <w:t xml:space="preserve">id, orgId, userId, role (OrgRole: OWNER | ADMIN | MEMBER), createdAt. Org-level membership separate from project-level membership.</w:t>
             </w:r>
           </w:p>
         </w:tc>
@@ -8685,7 +10081,7 @@
                 <w:sz w:val="20"/>
                 <w:szCs w:val="20"/>
               </w:rPr>
-              <w:t xml:space="preserve">ProjectMember</w:t>
+              <w:t xml:space="preserve">OrgInvite</w:t>
             </w:r>
           </w:p>
         </w:tc>
@@ -8722,7 +10118,7 @@
                 <w:sz w:val="20"/>
                 <w:szCs w:val="20"/>
               </w:rPr>
-              <w:t xml:space="preserve">id, userId, projectId, projectRole (ProjectLead | TeamMember | Viewer). Defines per-project role overrides. A user must have a ProjectMember record to access a private project.</w:t>
+              <w:t xml:space="preserve">id, orgId, email, token, role, accepted, expiresAt, createdAt. Token-based invite system for org membership.</w:t>
             </w:r>
           </w:p>
         </w:tc>
@@ -8761,7 +10157,7 @@
                 <w:sz w:val="20"/>
                 <w:szCs w:val="20"/>
               </w:rPr>
-              <w:t xml:space="preserve">Issue</w:t>
+              <w:t xml:space="preserve">Subscription</w:t>
             </w:r>
           </w:p>
         </w:tc>
@@ -8798,7 +10194,7 @@
                 <w:sz w:val="20"/>
                 <w:szCs w:val="20"/>
               </w:rPr>
-              <w:t xml:space="preserve">id, title, description, statusId (FK to Status), priority, assigneeId, reporterId, projectId, parentId (for subtasks), dueDate, createdAt, updatedAt.</w:t>
+              <w:t xml:space="preserve">id, orgId, stripeCustomerId, stripeSubscriptionId, stripePriceId, status (SubscriptionStatus), currentPeriodEnd, cancelAtPeriodEnd. Stripe billing schema — roughed in, not yet active.</w:t>
             </w:r>
           </w:p>
         </w:tc>
@@ -8837,7 +10233,7 @@
                 <w:sz w:val="20"/>
                 <w:szCs w:val="20"/>
               </w:rPr>
-              <w:t xml:space="preserve">Status</w:t>
+              <w:t xml:space="preserve">Project</w:t>
             </w:r>
           </w:p>
         </w:tc>
@@ -8874,7 +10270,7 @@
                 <w:sz w:val="20"/>
                 <w:szCs w:val="20"/>
               </w:rPr>
-              <w:t xml:space="preserve">id, name, color, category (ToDo | InProgress | Done), order, scopeType (Workspace | Project), workspaceId | projectId. Each category must always have at least one status. Admin-managed only.</w:t>
+              <w:t xml:space="preserve">id, name, key, description, orgId, createdAt, updatedAt. Note: isPrivate and isArchived fields are not yet in the schema — both are spec requirements pending implementation.</w:t>
             </w:r>
           </w:p>
         </w:tc>
@@ -8913,7 +10309,7 @@
                 <w:sz w:val="20"/>
                 <w:szCs w:val="20"/>
               </w:rPr>
-              <w:t xml:space="preserve">Comment</w:t>
+              <w:t xml:space="preserve">ProjectMember</w:t>
             </w:r>
           </w:p>
         </w:tc>
@@ -8950,7 +10346,7 @@
                 <w:sz w:val="20"/>
                 <w:szCs w:val="20"/>
               </w:rPr>
-              <w:t xml:space="preserve">id, body, authorId, issueId, createdAt.</w:t>
+              <w:t xml:space="preserve">id, userId, projectId, role (ProjectMemberRole: PROJECT_LEAD | TEAM_MEMBER | VIEWER). Defines per-project role. A user must have a ProjectMember record to access a private project.</w:t>
             </w:r>
           </w:p>
         </w:tc>
@@ -8989,7 +10385,7 @@
                 <w:sz w:val="20"/>
                 <w:szCs w:val="20"/>
               </w:rPr>
-              <w:t xml:space="preserve">Label</w:t>
+              <w:t xml:space="preserve">Project</w:t>
             </w:r>
           </w:p>
         </w:tc>
@@ -9026,7 +10422,7 @@
                 <w:sz w:val="20"/>
                 <w:szCs w:val="20"/>
               </w:rPr>
-              <w:t xml:space="preserve">id, name, color, projectId. Many-to-many with Issues.</w:t>
+              <w:t xml:space="preserve">id, name, key, description, orgId, isPrivate (boolean), isArchived (boolean), createdAt, updatedAt.</w:t>
             </w:r>
           </w:p>
         </w:tc>
@@ -9065,7 +10461,7 @@
                 <w:sz w:val="20"/>
                 <w:szCs w:val="20"/>
               </w:rPr>
-              <w:t xml:space="preserve">Attachment</w:t>
+              <w:t xml:space="preserve">Column</w:t>
             </w:r>
           </w:p>
         </w:tc>
@@ -9102,7 +10498,7 @@
                 <w:sz w:val="20"/>
                 <w:szCs w:val="20"/>
               </w:rPr>
-              <w:t xml:space="preserve">id, filename, url, mimeType, size, issueId, uploaderId, createdAt. (Planned — Railway Storage Buckets)</w:t>
+              <w:t xml:space="preserve">id, boardId, name, position, color. Named Kanban columns per board. Exists in schema but not yet used by KanbanBoard component.</w:t>
             </w:r>
           </w:p>
         </w:tc>
@@ -9141,7 +10537,7 @@
                 <w:sz w:val="20"/>
                 <w:szCs w:val="20"/>
               </w:rPr>
-              <w:t xml:space="preserve">Notification</w:t>
+              <w:t xml:space="preserve">Issue</w:t>
             </w:r>
           </w:p>
         </w:tc>
@@ -9178,7 +10574,7 @@
                 <w:sz w:val="20"/>
                 <w:szCs w:val="20"/>
               </w:rPr>
-              <w:t xml:space="preserve">id, type, message, userId, issueId, read, createdAt.</w:t>
+              <w:t xml:space="preserve">id, projectId, key, title, description, status (IssueStatus enum: TODO | IN_PROGRESS | IN_REVIEW | DONE), priority, type (IssueType), assigneeId, reporterId, parentId, position, labels (String[]), dueDate, createdAt, updatedAt. Note: status is a fixed enum — custom statusId FK is planned as part of the workflow feature.</w:t>
             </w:r>
           </w:p>
         </w:tc>
@@ -9217,7 +10613,7 @@
                 <w:sz w:val="20"/>
                 <w:szCs w:val="20"/>
               </w:rPr>
-              <w:t xml:space="preserve">Activity</w:t>
+              <w:t xml:space="preserve">Comment</w:t>
             </w:r>
           </w:p>
         </w:tc>
@@ -9254,7 +10650,7 @@
                 <w:sz w:val="20"/>
                 <w:szCs w:val="20"/>
               </w:rPr>
-              <w:t xml:space="preserve">id, type, description, userId, issueId, projectId, createdAt.</w:t>
+              <w:t xml:space="preserve">id, issueId, authorId, body, createdAt, updatedAt.</w:t>
             </w:r>
           </w:p>
         </w:tc>
@@ -9293,7 +10689,7 @@
                 <w:sz w:val="20"/>
                 <w:szCs w:val="20"/>
               </w:rPr>
-              <w:t xml:space="preserve">Milestone</w:t>
+              <w:t xml:space="preserve">SavedFilter</w:t>
             </w:r>
           </w:p>
         </w:tc>
@@ -9330,7 +10726,7 @@
                 <w:sz w:val="20"/>
                 <w:szCs w:val="20"/>
               </w:rPr>
-              <w:t xml:space="preserve">id, name, dueDate, projectId.</w:t>
+              <w:t xml:space="preserve">id, name, query, userId, isGlobal, createdAt. Named persisted search queries with optional global sharing.</w:t>
             </w:r>
           </w:p>
         </w:tc>
@@ -9369,7 +10765,7 @@
                 <w:sz w:val="20"/>
                 <w:szCs w:val="20"/>
               </w:rPr>
-              <w:t xml:space="preserve">Sprint</w:t>
+              <w:t xml:space="preserve">ActivityLog</w:t>
             </w:r>
           </w:p>
         </w:tc>
@@ -9406,7 +10802,387 @@
                 <w:sz w:val="20"/>
                 <w:szCs w:val="20"/>
               </w:rPr>
-              <w:t xml:space="preserve">id, name, startDate, endDate, projectId, status.</w:t>
+              <w:t xml:space="preserve">id, issueId, userId, action, field, oldValue, newValue, createdAt. Named ActivityLog in schema (not Activity). Activity is accessed via issue context; no top-level projectId field.</w:t>
+            </w:r>
+          </w:p>
+        </w:tc>
+      </w:tr>
+      <w:tr>
+        <w:tc>
+          <w:tcPr>
+            <w:tcW w:type="dxa" w:w="2200"/>
+            <w:tcBorders>
+              <w:top w:val="single" w:color="E2E8F0" w:sz="1"/>
+              <w:left w:val="single" w:color="E2E8F0" w:sz="1"/>
+              <w:bottom w:val="single" w:color="E2E8F0" w:sz="1"/>
+              <w:right w:val="single" w:color="E2E8F0" w:sz="1"/>
+            </w:tcBorders>
+            <w:shd w:fill="F8F9FA" w:val="clear"/>
+            <w:tcMar>
+              <w:top w:type="dxa" w:w="100"/>
+              <w:left w:type="dxa" w:w="140"/>
+              <w:bottom w:type="dxa" w:w="100"/>
+              <w:right w:type="dxa" w:w="140"/>
+            </w:tcMar>
+            <w:vAlign w:val="top"/>
+          </w:tcPr>
+          <w:p>
+            <w:pPr>
+              <w:spacing w:after="0" w:before="0"/>
+            </w:pPr>
+            <w:r>
+              <w:rPr>
+                <w:rFonts w:ascii="Arial" w:cs="Arial" w:eastAsia="Arial" w:hAnsi="Arial"/>
+                <w:b/>
+                <w:bCs/>
+                <w:i w:val="false"/>
+                <w:iCs w:val="false"/>
+                <w:color w:val="FF6A00"/>
+                <w:sz w:val="20"/>
+                <w:szCs w:val="20"/>
+              </w:rPr>
+              <w:t xml:space="preserve">Attachment</w:t>
+            </w:r>
+          </w:p>
+        </w:tc>
+        <w:tc>
+          <w:tcPr>
+            <w:tcW w:type="dxa" w:w="7160"/>
+            <w:tcBorders>
+              <w:top w:val="single" w:color="E2E8F0" w:sz="1"/>
+              <w:left w:val="single" w:color="E2E8F0" w:sz="1"/>
+              <w:bottom w:val="single" w:color="E2E8F0" w:sz="1"/>
+              <w:right w:val="single" w:color="E2E8F0" w:sz="1"/>
+            </w:tcBorders>
+            <w:shd w:fill="F8F9FA" w:val="clear"/>
+            <w:tcMar>
+              <w:top w:type="dxa" w:w="100"/>
+              <w:left w:type="dxa" w:w="140"/>
+              <w:bottom w:type="dxa" w:w="100"/>
+              <w:right w:type="dxa" w:w="140"/>
+            </w:tcMar>
+            <w:vAlign w:val="top"/>
+          </w:tcPr>
+          <w:p>
+            <w:pPr>
+              <w:spacing w:after="0" w:before="0"/>
+            </w:pPr>
+            <w:r>
+              <w:rPr>
+                <w:rFonts w:ascii="Arial" w:cs="Arial" w:eastAsia="Arial" w:hAnsi="Arial"/>
+                <w:b w:val="false"/>
+                <w:bCs w:val="false"/>
+                <w:i w:val="false"/>
+                <w:iCs w:val="false"/>
+                <w:color w:val="1F232B"/>
+                <w:sz w:val="20"/>
+                <w:szCs w:val="20"/>
+              </w:rPr>
+              <w:t xml:space="preserve">id, issueId, uploaderId, fileName, fileKey, fileSize, mimeType, createdAt. fileKey is the S3 object key; presigned URLs are generated on demand rather than stored.</w:t>
+            </w:r>
+          </w:p>
+        </w:tc>
+      </w:tr>
+      <w:tr>
+        <w:tc>
+          <w:tcPr>
+            <w:tcW w:type="dxa" w:w="2200"/>
+            <w:tcBorders>
+              <w:top w:val="single" w:color="E2E8F0" w:sz="1"/>
+              <w:left w:val="single" w:color="E2E8F0" w:sz="1"/>
+              <w:bottom w:val="single" w:color="E2E8F0" w:sz="1"/>
+              <w:right w:val="single" w:color="E2E8F0" w:sz="1"/>
+            </w:tcBorders>
+            <w:shd w:fill="FFFFFF" w:val="clear"/>
+            <w:tcMar>
+              <w:top w:type="dxa" w:w="100"/>
+              <w:left w:type="dxa" w:w="140"/>
+              <w:bottom w:type="dxa" w:w="100"/>
+              <w:right w:type="dxa" w:w="140"/>
+            </w:tcMar>
+            <w:vAlign w:val="top"/>
+          </w:tcPr>
+          <w:p>
+            <w:pPr>
+              <w:spacing w:after="0" w:before="0"/>
+            </w:pPr>
+            <w:r>
+              <w:rPr>
+                <w:rFonts w:ascii="Arial" w:cs="Arial" w:eastAsia="Arial" w:hAnsi="Arial"/>
+                <w:b/>
+                <w:bCs/>
+                <w:i w:val="false"/>
+                <w:iCs w:val="false"/>
+                <w:color w:val="FF6A00"/>
+                <w:sz w:val="20"/>
+                <w:szCs w:val="20"/>
+              </w:rPr>
+              <w:t xml:space="preserve">Notification</w:t>
+            </w:r>
+          </w:p>
+        </w:tc>
+        <w:tc>
+          <w:tcPr>
+            <w:tcW w:type="dxa" w:w="7160"/>
+            <w:tcBorders>
+              <w:top w:val="single" w:color="E2E8F0" w:sz="1"/>
+              <w:left w:val="single" w:color="E2E8F0" w:sz="1"/>
+              <w:bottom w:val="single" w:color="E2E8F0" w:sz="1"/>
+              <w:right w:val="single" w:color="E2E8F0" w:sz="1"/>
+            </w:tcBorders>
+            <w:shd w:fill="FFFFFF" w:val="clear"/>
+            <w:tcMar>
+              <w:top w:type="dxa" w:w="100"/>
+              <w:left w:type="dxa" w:w="140"/>
+              <w:bottom w:type="dxa" w:w="100"/>
+              <w:right w:type="dxa" w:w="140"/>
+            </w:tcMar>
+            <w:vAlign w:val="top"/>
+          </w:tcPr>
+          <w:p>
+            <w:pPr>
+              <w:spacing w:after="0" w:before="0"/>
+            </w:pPr>
+            <w:r>
+              <w:rPr>
+                <w:rFonts w:ascii="Arial" w:cs="Arial" w:eastAsia="Arial" w:hAnsi="Arial"/>
+                <w:b w:val="false"/>
+                <w:bCs w:val="false"/>
+                <w:i w:val="false"/>
+                <w:iCs w:val="false"/>
+                <w:color w:val="1F232B"/>
+                <w:sz w:val="20"/>
+                <w:szCs w:val="20"/>
+              </w:rPr>
+              <w:t xml:space="preserve">Not yet in schema. Planned: id, type, message, userId, issueId, read, createdAt.</w:t>
+            </w:r>
+          </w:p>
+        </w:tc>
+      </w:tr>
+      <w:tr>
+        <w:tc>
+          <w:tcPr>
+            <w:tcW w:type="dxa" w:w="2200"/>
+            <w:tcBorders>
+              <w:top w:val="single" w:color="E2E8F0" w:sz="1"/>
+              <w:left w:val="single" w:color="E2E8F0" w:sz="1"/>
+              <w:bottom w:val="single" w:color="E2E8F0" w:sz="1"/>
+              <w:right w:val="single" w:color="E2E8F0" w:sz="1"/>
+            </w:tcBorders>
+            <w:shd w:fill="F8F9FA" w:val="clear"/>
+            <w:tcMar>
+              <w:top w:type="dxa" w:w="100"/>
+              <w:left w:type="dxa" w:w="140"/>
+              <w:bottom w:type="dxa" w:w="100"/>
+              <w:right w:type="dxa" w:w="140"/>
+            </w:tcMar>
+            <w:vAlign w:val="top"/>
+          </w:tcPr>
+          <w:p>
+            <w:pPr>
+              <w:spacing w:after="0" w:before="0"/>
+            </w:pPr>
+            <w:r>
+              <w:rPr>
+                <w:rFonts w:ascii="Arial" w:cs="Arial" w:eastAsia="Arial" w:hAnsi="Arial"/>
+                <w:b/>
+                <w:bCs/>
+                <w:i w:val="false"/>
+                <w:iCs w:val="false"/>
+                <w:color w:val="FF6A00"/>
+                <w:sz w:val="20"/>
+                <w:szCs w:val="20"/>
+              </w:rPr>
+              <w:t xml:space="preserve">Milestone</w:t>
+            </w:r>
+          </w:p>
+        </w:tc>
+        <w:tc>
+          <w:tcPr>
+            <w:tcW w:type="dxa" w:w="7160"/>
+            <w:tcBorders>
+              <w:top w:val="single" w:color="E2E8F0" w:sz="1"/>
+              <w:left w:val="single" w:color="E2E8F0" w:sz="1"/>
+              <w:bottom w:val="single" w:color="E2E8F0" w:sz="1"/>
+              <w:right w:val="single" w:color="E2E8F0" w:sz="1"/>
+            </w:tcBorders>
+            <w:shd w:fill="F8F9FA" w:val="clear"/>
+            <w:tcMar>
+              <w:top w:type="dxa" w:w="100"/>
+              <w:left w:type="dxa" w:w="140"/>
+              <w:bottom w:type="dxa" w:w="100"/>
+              <w:right w:type="dxa" w:w="140"/>
+            </w:tcMar>
+            <w:vAlign w:val="top"/>
+          </w:tcPr>
+          <w:p>
+            <w:pPr>
+              <w:spacing w:after="0" w:before="0"/>
+            </w:pPr>
+            <w:r>
+              <w:rPr>
+                <w:rFonts w:ascii="Arial" w:cs="Arial" w:eastAsia="Arial" w:hAnsi="Arial"/>
+                <w:b w:val="false"/>
+                <w:bCs w:val="false"/>
+                <w:i w:val="false"/>
+                <w:iCs w:val="false"/>
+                <w:color w:val="1F232B"/>
+                <w:sz w:val="20"/>
+                <w:szCs w:val="20"/>
+              </w:rPr>
+              <w:t xml:space="preserve">Not yet in schema. Planned: id, name, dueDate, projectId.</w:t>
+            </w:r>
+          </w:p>
+        </w:tc>
+      </w:tr>
+      <w:tr>
+        <w:tc>
+          <w:tcPr>
+            <w:tcW w:type="dxa" w:w="2200"/>
+            <w:tcBorders>
+              <w:top w:val="single" w:color="E2E8F0" w:sz="1"/>
+              <w:left w:val="single" w:color="E2E8F0" w:sz="1"/>
+              <w:bottom w:val="single" w:color="E2E8F0" w:sz="1"/>
+              <w:right w:val="single" w:color="E2E8F0" w:sz="1"/>
+            </w:tcBorders>
+            <w:shd w:fill="FFFFFF" w:val="clear"/>
+            <w:tcMar>
+              <w:top w:type="dxa" w:w="100"/>
+              <w:left w:type="dxa" w:w="140"/>
+              <w:bottom w:type="dxa" w:w="100"/>
+              <w:right w:type="dxa" w:w="140"/>
+            </w:tcMar>
+            <w:vAlign w:val="top"/>
+          </w:tcPr>
+          <w:p>
+            <w:pPr>
+              <w:spacing w:after="0" w:before="0"/>
+            </w:pPr>
+            <w:r>
+              <w:rPr>
+                <w:rFonts w:ascii="Arial" w:cs="Arial" w:eastAsia="Arial" w:hAnsi="Arial"/>
+                <w:b/>
+                <w:bCs/>
+                <w:i w:val="false"/>
+                <w:iCs w:val="false"/>
+                <w:color w:val="FF6A00"/>
+                <w:sz w:val="20"/>
+                <w:szCs w:val="20"/>
+              </w:rPr>
+              <w:t xml:space="preserve">Sprint</w:t>
+            </w:r>
+          </w:p>
+        </w:tc>
+        <w:tc>
+          <w:tcPr>
+            <w:tcW w:type="dxa" w:w="7160"/>
+            <w:tcBorders>
+              <w:top w:val="single" w:color="E2E8F0" w:sz="1"/>
+              <w:left w:val="single" w:color="E2E8F0" w:sz="1"/>
+              <w:bottom w:val="single" w:color="E2E8F0" w:sz="1"/>
+              <w:right w:val="single" w:color="E2E8F0" w:sz="1"/>
+            </w:tcBorders>
+            <w:shd w:fill="FFFFFF" w:val="clear"/>
+            <w:tcMar>
+              <w:top w:type="dxa" w:w="100"/>
+              <w:left w:type="dxa" w:w="140"/>
+              <w:bottom w:type="dxa" w:w="100"/>
+              <w:right w:type="dxa" w:w="140"/>
+            </w:tcMar>
+            <w:vAlign w:val="top"/>
+          </w:tcPr>
+          <w:p>
+            <w:pPr>
+              <w:spacing w:after="0" w:before="0"/>
+            </w:pPr>
+            <w:r>
+              <w:rPr>
+                <w:rFonts w:ascii="Arial" w:cs="Arial" w:eastAsia="Arial" w:hAnsi="Arial"/>
+                <w:b w:val="false"/>
+                <w:bCs w:val="false"/>
+                <w:i w:val="false"/>
+                <w:iCs w:val="false"/>
+                <w:color w:val="1F232B"/>
+                <w:sz w:val="20"/>
+                <w:szCs w:val="20"/>
+              </w:rPr>
+              <w:t xml:space="preserve">Not yet in schema. Planned: id, name, startDate, endDate, projectId, status.</w:t>
+            </w:r>
+          </w:p>
+        </w:tc>
+      </w:tr>
+      <w:tr>
+        <w:tc>
+          <w:tcPr>
+            <w:tcW w:type="dxa" w:w="2200"/>
+            <w:tcBorders>
+              <w:top w:val="single" w:color="E2E8F0" w:sz="1"/>
+              <w:left w:val="single" w:color="E2E8F0" w:sz="1"/>
+              <w:bottom w:val="single" w:color="E2E8F0" w:sz="1"/>
+              <w:right w:val="single" w:color="E2E8F0" w:sz="1"/>
+            </w:tcBorders>
+            <w:shd w:fill="F8F9FA" w:val="clear"/>
+            <w:tcMar>
+              <w:top w:type="dxa" w:w="100"/>
+              <w:left w:type="dxa" w:w="140"/>
+              <w:bottom w:type="dxa" w:w="100"/>
+              <w:right w:type="dxa" w:w="140"/>
+            </w:tcMar>
+            <w:vAlign w:val="top"/>
+          </w:tcPr>
+          <w:p>
+            <w:pPr>
+              <w:spacing w:after="0" w:before="0"/>
+            </w:pPr>
+            <w:r>
+              <w:rPr>
+                <w:rFonts w:ascii="Arial" w:cs="Arial" w:eastAsia="Arial" w:hAnsi="Arial"/>
+                <w:b/>
+                <w:bCs/>
+                <w:i w:val="false"/>
+                <w:iCs w:val="false"/>
+                <w:color w:val="FF6A00"/>
+                <w:sz w:val="20"/>
+                <w:szCs w:val="20"/>
+              </w:rPr>
+              <w:t xml:space="preserve">Status</w:t>
+            </w:r>
+          </w:p>
+        </w:tc>
+        <w:tc>
+          <w:tcPr>
+            <w:tcW w:type="dxa" w:w="7160"/>
+            <w:tcBorders>
+              <w:top w:val="single" w:color="E2E8F0" w:sz="1"/>
+              <w:left w:val="single" w:color="E2E8F0" w:sz="1"/>
+              <w:bottom w:val="single" w:color="E2E8F0" w:sz="1"/>
+              <w:right w:val="single" w:color="E2E8F0" w:sz="1"/>
+            </w:tcBorders>
+            <w:shd w:fill="F8F9FA" w:val="clear"/>
+            <w:tcMar>
+              <w:top w:type="dxa" w:w="100"/>
+              <w:left w:type="dxa" w:w="140"/>
+              <w:bottom w:type="dxa" w:w="100"/>
+              <w:right w:type="dxa" w:w="140"/>
+            </w:tcMar>
+            <w:vAlign w:val="top"/>
+          </w:tcPr>
+          <w:p>
+            <w:pPr>
+              <w:spacing w:after="0" w:before="0"/>
+            </w:pPr>
+            <w:r>
+              <w:rPr>
+                <w:rFonts w:ascii="Arial" w:cs="Arial" w:eastAsia="Arial" w:hAnsi="Arial"/>
+                <w:b w:val="false"/>
+                <w:bCs w:val="false"/>
+                <w:i w:val="false"/>
+                <w:iCs w:val="false"/>
+                <w:color w:val="1F232B"/>
+                <w:sz w:val="20"/>
+                <w:szCs w:val="20"/>
+              </w:rPr>
+              <w:t xml:space="preserve">Not yet in schema. Planned: id, name, color, category (ToDo | InProgress | Done), order, scopeType (Org | Project), orgId | projectId. Required for custom workflow feature.</w:t>
             </w:r>
           </w:p>
         </w:tc>
@@ -9674,7 +11450,7 @@
                 <w:sz w:val="20"/>
                 <w:szCs w:val="20"/>
               </w:rPr>
-              <w:t xml:space="preserve">File Attachments / Screenshots</w:t>
+              <w:t xml:space="preserve">In-App Notifications</w:t>
             </w:r>
           </w:p>
         </w:tc>
@@ -9711,7 +11487,7 @@
                 <w:sz w:val="20"/>
                 <w:szCs w:val="20"/>
               </w:rPr>
-              <w:t xml:space="preserve">Full implementation plan defined. Uses Railway Storage Buckets. Prisma Attachment model, lib/s3.ts, four API routes (presign, confirm, delete, URL refresh), and AttachmentsPanel component with drag-and-drop.</w:t>
+              <w:t xml:space="preserve">Previously marked as Built — confirmed not implemented. Requires Notification model, delivery on key events (assign, comment, status change), bell UI in header with unread count, and mark-read functionality.</w:t>
             </w:r>
           </w:p>
         </w:tc>
@@ -9824,7 +11600,7 @@
                 <w:sz w:val="20"/>
                 <w:szCs w:val="20"/>
               </w:rPr>
-              <w:t xml:space="preserve">Allow admins or users to define custom issue statuses and transitions. Requires an open decision on scoping and reserved statuses before implementation begins.</w:t>
+              <w:t xml:space="preserve">Design fully resolved (see Section 5). Requires wiring Board/Column models to Kanban renderer, building Status model, and migrating issues from fixed enum to statusId FK. Admin UI for status management needed.</w:t>
             </w:r>
           </w:p>
         </w:tc>
@@ -9937,7 +11713,7 @@
                 <w:sz w:val="20"/>
                 <w:szCs w:val="20"/>
               </w:rPr>
-              <w:t xml:space="preserve">Outbound email for assignments, mentions, and due date reminders. Email provider not yet selected.</w:t>
+              <w:t xml:space="preserve">Outbound email for assignments, mentions, and due date reminders. Email provider not yet selected (see Open Decision #3). Dependent on In-App Notifications being built first for the event model.</w:t>
             </w:r>
           </w:p>
         </w:tc>
@@ -9981,7 +11757,7 @@
           <w:sz w:val="22"/>
           <w:szCs w:val="22"/>
         </w:rPr>
-        <w:t xml:space="preserve">Sprints &amp; Iterations</w:t>
+        <w:t xml:space="preserve">GitHub OAuth login</w:t>
       </w:r>
     </w:p>
     <w:p>
@@ -10000,7 +11776,7 @@
           <w:sz w:val="22"/>
           <w:szCs w:val="22"/>
         </w:rPr>
-        <w:t xml:space="preserve">Milestones</w:t>
+        <w:t xml:space="preserve">Real-Time Collaboration (SSE)</w:t>
       </w:r>
     </w:p>
     <w:p>
@@ -10019,7 +11795,7 @@
           <w:sz w:val="22"/>
           <w:szCs w:val="22"/>
         </w:rPr>
-        <w:t xml:space="preserve">Roadmap / Gantt View</w:t>
+        <w:t xml:space="preserve">Sprints &amp; Iterations</w:t>
       </w:r>
     </w:p>
     <w:p>
@@ -10038,7 +11814,7 @@
           <w:sz w:val="22"/>
           <w:szCs w:val="22"/>
         </w:rPr>
-        <w:t xml:space="preserve">Dashboard &amp; Analytics</w:t>
+        <w:t xml:space="preserve">Milestones</w:t>
       </w:r>
     </w:p>
     <w:p>
@@ -10057,7 +11833,7 @@
           <w:sz w:val="22"/>
           <w:szCs w:val="22"/>
         </w:rPr>
-        <w:t xml:space="preserve">GitHub Issue Linking</w:t>
+        <w:t xml:space="preserve">Roadmap / Gantt View</w:t>
       </w:r>
     </w:p>
     <w:p>
@@ -10076,7 +11852,7 @@
           <w:sz w:val="22"/>
           <w:szCs w:val="22"/>
         </w:rPr>
-        <w:t xml:space="preserve">Webhook Support (Outbound)</w:t>
+        <w:t xml:space="preserve">Dashboard &amp; Analytics</w:t>
       </w:r>
     </w:p>
     <w:p>
@@ -10095,7 +11871,7 @@
           <w:sz w:val="22"/>
           <w:szCs w:val="22"/>
         </w:rPr>
-        <w:t xml:space="preserve">Import / Export (CSV and third-party)</w:t>
+        <w:t xml:space="preserve">GitHub Issue Linking</w:t>
       </w:r>
     </w:p>
     <w:p>
@@ -10114,7 +11890,103 @@
           <w:sz w:val="22"/>
           <w:szCs w:val="22"/>
         </w:rPr>
+        <w:t xml:space="preserve">Webhook Support (Outbound)</w:t>
+      </w:r>
+    </w:p>
+    <w:p>
+      <w:pPr>
+        <w:pStyle w:val="ListParagraph"/>
+        <w:numPr>
+          <w:ilvl w:val="0"/>
+          <w:numId w:val="2"/>
+        </w:numPr>
+        <w:spacing w:after="40" w:before="40"/>
+      </w:pPr>
+      <w:r>
+        <w:rPr>
+          <w:rFonts w:ascii="Arial" w:cs="Arial" w:eastAsia="Arial" w:hAnsi="Arial"/>
+          <w:color w:val="1F232B"/>
+          <w:sz w:val="22"/>
+          <w:szCs w:val="22"/>
+        </w:rPr>
+        <w:t xml:space="preserve">Import / Export (CSV and third-party)</w:t>
+      </w:r>
+    </w:p>
+    <w:p>
+      <w:pPr>
+        <w:pStyle w:val="ListParagraph"/>
+        <w:numPr>
+          <w:ilvl w:val="0"/>
+          <w:numId w:val="2"/>
+        </w:numPr>
+        <w:spacing w:after="40" w:before="40"/>
+      </w:pPr>
+      <w:r>
+        <w:rPr>
+          <w:rFonts w:ascii="Arial" w:cs="Arial" w:eastAsia="Arial" w:hAnsi="Arial"/>
+          <w:color w:val="1F232B"/>
+          <w:sz w:val="22"/>
+          <w:szCs w:val="22"/>
+        </w:rPr>
         <w:t xml:space="preserve">Mobile App (React Native or PWA)</w:t>
+      </w:r>
+    </w:p>
+    <w:p>
+      <w:pPr>
+        <w:spacing w:after="0" w:before="80"/>
+      </w:pPr>
+    </w:p>
+    <w:p>
+      <w:pPr>
+        <w:pStyle w:val="Heading2"/>
+        <w:spacing w:after="80" w:before="200"/>
+      </w:pPr>
+      <w:r>
+        <w:rPr>
+          <w:rFonts w:ascii="Arial" w:cs="Arial" w:eastAsia="Arial" w:hAnsi="Arial"/>
+          <w:b/>
+          <w:bCs/>
+          <w:color w:val="1F232B"/>
+          <w:sz w:val="24"/>
+          <w:szCs w:val="24"/>
+        </w:rPr>
+        <w:t xml:space="preserve">Code Alignment Items (Spec-to-Code Gaps)</w:t>
+      </w:r>
+    </w:p>
+    <w:p>
+      <w:pPr>
+        <w:spacing w:after="60" w:before="60"/>
+        <w:jc w:val="left"/>
+      </w:pPr>
+      <w:r>
+        <w:rPr>
+          <w:rFonts w:ascii="Arial" w:cs="Arial" w:eastAsia="Arial" w:hAnsi="Arial"/>
+          <w:b w:val="false"/>
+          <w:bCs w:val="false"/>
+          <w:color w:val="1F232B"/>
+          <w:sz w:val="22"/>
+          <w:szCs w:val="22"/>
+        </w:rPr>
+        <w:t xml:space="preserve">These are not new features but corrections needed to align the codebase with spec decisions already made:</w:t>
+      </w:r>
+    </w:p>
+    <w:p>
+      <w:pPr>
+        <w:pStyle w:val="ListParagraph"/>
+        <w:numPr>
+          <w:ilvl w:val="0"/>
+          <w:numId w:val="2"/>
+        </w:numPr>
+        <w:spacing w:after="40" w:before="40"/>
+      </w:pPr>
+      <w:r>
+        <w:rPr>
+          <w:rFonts w:ascii="Arial" w:cs="Arial" w:eastAsia="Arial" w:hAnsi="Arial"/>
+          <w:color w:val="1F232B"/>
+          <w:sz w:val="22"/>
+          <w:szCs w:val="22"/>
+        </w:rPr>
+        <w:t xml:space="preserve">AutoRefresh interval: currently 3 minutes. Will be replaced by SSE implementation — no interim change planned.</w:t>
       </w:r>
     </w:p>
     <w:p>
@@ -10760,7 +12632,7 @@
                 <w:sz w:val="20"/>
                 <w:szCs w:val="20"/>
               </w:rPr>
-              <w:t xml:space="preserve">Free-forever vs. freemium vs. paid SaaS. Must be decided before any public-facing growth work begins. Impacts workspace limits, feature gating, and billing infrastructure.</w:t>
+              <w:t xml:space="preserve">Free-forever vs. freemium vs. paid SaaS. Stripe billing schema is already roughed into the codebase (Subscription model, Plan enum). Must be decided before billing logic is activated. Impacts workspace limits, feature gating, and billing infrastructure.</w:t>
             </w:r>
           </w:p>
         </w:tc>
@@ -10874,6 +12746,232 @@
                 <w:szCs w:val="20"/>
               </w:rPr>
               <w:t xml:space="preserve">A progressive web app (PWA) can be built within the existing Next.js codebase. React Native is a separate app. This decision affects roadmap, timeline, and tech complexity significantly.</w:t>
+            </w:r>
+          </w:p>
+        </w:tc>
+      </w:tr>
+      <w:tr>
+        <w:tc>
+          <w:tcPr>
+            <w:tcW w:type="dxa" w:w="400"/>
+            <w:tcBorders>
+              <w:top w:val="single" w:color="E2E8F0" w:sz="1"/>
+              <w:left w:val="single" w:color="E2E8F0" w:sz="1"/>
+              <w:bottom w:val="single" w:color="E2E8F0" w:sz="1"/>
+              <w:right w:val="single" w:color="E2E8F0" w:sz="1"/>
+            </w:tcBorders>
+            <w:shd w:fill="F8F9FA" w:val="clear"/>
+            <w:tcMar>
+              <w:top w:type="dxa" w:w="100"/>
+              <w:left w:type="dxa" w:w="140"/>
+              <w:bottom w:type="dxa" w:w="100"/>
+              <w:right w:type="dxa" w:w="140"/>
+            </w:tcMar>
+            <w:vAlign w:val="top"/>
+          </w:tcPr>
+          <w:p>
+            <w:pPr>
+              <w:spacing w:after="0" w:before="0"/>
+            </w:pPr>
+            <w:r>
+              <w:rPr>
+                <w:rFonts w:ascii="Arial" w:cs="Arial" w:eastAsia="Arial" w:hAnsi="Arial"/>
+                <w:b/>
+                <w:bCs/>
+                <w:i w:val="false"/>
+                <w:iCs w:val="false"/>
+                <w:color w:val="FF6A00"/>
+                <w:sz w:val="20"/>
+                <w:szCs w:val="20"/>
+              </w:rPr>
+              <w:t xml:space="preserve">6 ✓</w:t>
+            </w:r>
+          </w:p>
+        </w:tc>
+        <w:tc>
+          <w:tcPr>
+            <w:tcW w:type="dxa" w:w="3200"/>
+            <w:tcBorders>
+              <w:top w:val="single" w:color="E2E8F0" w:sz="1"/>
+              <w:left w:val="single" w:color="E2E8F0" w:sz="1"/>
+              <w:bottom w:val="single" w:color="E2E8F0" w:sz="1"/>
+              <w:right w:val="single" w:color="E2E8F0" w:sz="1"/>
+            </w:tcBorders>
+            <w:shd w:fill="F8F9FA" w:val="clear"/>
+            <w:tcMar>
+              <w:top w:type="dxa" w:w="100"/>
+              <w:left w:type="dxa" w:w="140"/>
+              <w:bottom w:type="dxa" w:w="100"/>
+              <w:right w:type="dxa" w:w="140"/>
+            </w:tcMar>
+            <w:vAlign w:val="top"/>
+          </w:tcPr>
+          <w:p>
+            <w:pPr>
+              <w:spacing w:after="0" w:before="0"/>
+            </w:pPr>
+            <w:r>
+              <w:rPr>
+                <w:rFonts w:ascii="Arial" w:cs="Arial" w:eastAsia="Arial" w:hAnsi="Arial"/>
+                <w:b/>
+                <w:bCs/>
+                <w:i w:val="false"/>
+                <w:iCs w:val="false"/>
+                <w:color w:val="1F232B"/>
+                <w:sz w:val="20"/>
+                <w:szCs w:val="20"/>
+              </w:rPr>
+              <w:t xml:space="preserve">Self-Registration Policy — RESOLVED</w:t>
+            </w:r>
+          </w:p>
+        </w:tc>
+        <w:tc>
+          <w:tcPr>
+            <w:tcW w:type="dxa" w:w="5760"/>
+            <w:tcBorders>
+              <w:top w:val="single" w:color="E2E8F0" w:sz="1"/>
+              <w:left w:val="single" w:color="E2E8F0" w:sz="1"/>
+              <w:bottom w:val="single" w:color="E2E8F0" w:sz="1"/>
+              <w:right w:val="single" w:color="E2E8F0" w:sz="1"/>
+            </w:tcBorders>
+            <w:shd w:fill="F8F9FA" w:val="clear"/>
+            <w:tcMar>
+              <w:top w:type="dxa" w:w="100"/>
+              <w:left w:type="dxa" w:w="140"/>
+              <w:bottom w:type="dxa" w:w="100"/>
+              <w:right w:type="dxa" w:w="140"/>
+            </w:tcMar>
+            <w:vAlign w:val="top"/>
+          </w:tcPr>
+          <w:p>
+            <w:pPr>
+              <w:spacing w:after="0" w:before="0"/>
+            </w:pPr>
+            <w:r>
+              <w:rPr>
+                <w:rFonts w:ascii="Arial" w:cs="Arial" w:eastAsia="Arial" w:hAnsi="Arial"/>
+                <w:b w:val="false"/>
+                <w:bCs w:val="false"/>
+                <w:i w:val="false"/>
+                <w:iCs w:val="false"/>
+                <w:color w:val="1F232B"/>
+                <w:sz w:val="20"/>
+                <w:szCs w:val="20"/>
+              </w:rPr>
+              <w:t xml:space="preserve">Self-registration disabled. /register route returns 403. Register page shows contact-your-administrator message. Account creation is Admin-only via /admin/users. See Section 2.</w:t>
+            </w:r>
+          </w:p>
+        </w:tc>
+      </w:tr>
+      <w:tr>
+        <w:tc>
+          <w:tcPr>
+            <w:tcW w:type="dxa" w:w="400"/>
+            <w:tcBorders>
+              <w:top w:val="single" w:color="E2E8F0" w:sz="1"/>
+              <w:left w:val="single" w:color="E2E8F0" w:sz="1"/>
+              <w:bottom w:val="single" w:color="E2E8F0" w:sz="1"/>
+              <w:right w:val="single" w:color="E2E8F0" w:sz="1"/>
+            </w:tcBorders>
+            <w:shd w:fill="FFFFFF" w:val="clear"/>
+            <w:tcMar>
+              <w:top w:type="dxa" w:w="100"/>
+              <w:left w:type="dxa" w:w="140"/>
+              <w:bottom w:type="dxa" w:w="100"/>
+              <w:right w:type="dxa" w:w="140"/>
+            </w:tcMar>
+            <w:vAlign w:val="top"/>
+          </w:tcPr>
+          <w:p>
+            <w:pPr>
+              <w:spacing w:after="0" w:before="0"/>
+            </w:pPr>
+            <w:r>
+              <w:rPr>
+                <w:rFonts w:ascii="Arial" w:cs="Arial" w:eastAsia="Arial" w:hAnsi="Arial"/>
+                <w:b/>
+                <w:bCs/>
+                <w:i w:val="false"/>
+                <w:iCs w:val="false"/>
+                <w:color w:val="FF6A00"/>
+                <w:sz w:val="20"/>
+                <w:szCs w:val="20"/>
+              </w:rPr>
+              <w:t xml:space="preserve">7 ✓</w:t>
+            </w:r>
+          </w:p>
+        </w:tc>
+        <w:tc>
+          <w:tcPr>
+            <w:tcW w:type="dxa" w:w="3200"/>
+            <w:tcBorders>
+              <w:top w:val="single" w:color="E2E8F0" w:sz="1"/>
+              <w:left w:val="single" w:color="E2E8F0" w:sz="1"/>
+              <w:bottom w:val="single" w:color="E2E8F0" w:sz="1"/>
+              <w:right w:val="single" w:color="E2E8F0" w:sz="1"/>
+            </w:tcBorders>
+            <w:shd w:fill="FFFFFF" w:val="clear"/>
+            <w:tcMar>
+              <w:top w:type="dxa" w:w="100"/>
+              <w:left w:type="dxa" w:w="140"/>
+              <w:bottom w:type="dxa" w:w="100"/>
+              <w:right w:type="dxa" w:w="140"/>
+            </w:tcMar>
+            <w:vAlign w:val="top"/>
+          </w:tcPr>
+          <w:p>
+            <w:pPr>
+              <w:spacing w:after="0" w:before="0"/>
+            </w:pPr>
+            <w:r>
+              <w:rPr>
+                <w:rFonts w:ascii="Arial" w:cs="Arial" w:eastAsia="Arial" w:hAnsi="Arial"/>
+                <w:b/>
+                <w:bCs/>
+                <w:i w:val="false"/>
+                <w:iCs w:val="false"/>
+                <w:color w:val="1F232B"/>
+                <w:sz w:val="20"/>
+                <w:szCs w:val="20"/>
+              </w:rPr>
+              <w:t xml:space="preserve">Role Enum Alignment — RESOLVED</w:t>
+            </w:r>
+          </w:p>
+        </w:tc>
+        <w:tc>
+          <w:tcPr>
+            <w:tcW w:type="dxa" w:w="5760"/>
+            <w:tcBorders>
+              <w:top w:val="single" w:color="E2E8F0" w:sz="1"/>
+              <w:left w:val="single" w:color="E2E8F0" w:sz="1"/>
+              <w:bottom w:val="single" w:color="E2E8F0" w:sz="1"/>
+              <w:right w:val="single" w:color="E2E8F0" w:sz="1"/>
+            </w:tcBorders>
+            <w:shd w:fill="FFFFFF" w:val="clear"/>
+            <w:tcMar>
+              <w:top w:type="dxa" w:w="100"/>
+              <w:left w:type="dxa" w:w="140"/>
+              <w:bottom w:type="dxa" w:w="100"/>
+              <w:right w:type="dxa" w:w="140"/>
+            </w:tcMar>
+            <w:vAlign w:val="top"/>
+          </w:tcPr>
+          <w:p>
+            <w:pPr>
+              <w:spacing w:after="0" w:before="0"/>
+            </w:pPr>
+            <w:r>
+              <w:rPr>
+                <w:rFonts w:ascii="Arial" w:cs="Arial" w:eastAsia="Arial" w:hAnsi="Arial"/>
+                <w:b w:val="false"/>
+                <w:bCs w:val="false"/>
+                <w:i w:val="false"/>
+                <w:iCs w:val="false"/>
+                <w:color w:val="1F232B"/>
+                <w:sz w:val="20"/>
+                <w:szCs w:val="20"/>
+              </w:rPr>
+              <w:t xml:space="preserve">UserRole aligned to ADMIN | TEAM_MEMBER | VIEWER. ProjectMemberRole aligned to PROJECT_LEAD | TEAM_MEMBER | VIEWER. All codebase references updated. Migration applied.</w:t>
             </w:r>
           </w:p>
         </w:tc>
@@ -11237,7 +13335,7 @@
           <w:sz w:val="20"/>
           <w:szCs w:val="20"/>
         </w:rPr>
-        <w:t xml:space="preserve">End of Document  •  JedForge Functional Specification v1.2</w:t>
+        <w:t xml:space="preserve">End of Document  •  JedForge Functional Specification v1.4</w:t>
       </w:r>
     </w:p>
     <w:sectPr>

</xml_diff>